<commit_message>
[update] Add fotos e vídeos
Adicionando fotos e o vídeo do protótipo físico (manopla)
</commit_message>
<xml_diff>
--- a/2026/trabalhos/TCC/Sistemas_Embarcados_HistoriandoFinal2.0.docx
+++ b/2026/trabalhos/TCC/Sistemas_Embarcados_HistoriandoFinal2.0.docx
@@ -715,7 +715,7 @@
           <w:lang w:eastAsia="pt-BR"/>
         </w:rPr>
         <w:drawing>
-          <wp:inline distT="0" distB="0" distL="0" distR="0" wp14:anchorId="4FD6C4E9" wp14:editId="00241F83">
+          <wp:inline distT="0" distB="0" distL="0" distR="0" wp14:anchorId="4FD6C4E9" wp14:editId="4A461BBC">
             <wp:extent cx="5760085" cy="3261995"/>
             <wp:effectExtent l="0" t="0" r="0" b="0"/>
             <wp:docPr id="1" name="Imagem 1"/>
@@ -1855,6 +1855,7 @@
           <w:lang w:eastAsia="pt-BR"/>
         </w:rPr>
       </w:pPr>
+      <w:proofErr w:type="spellStart"/>
       <w:r>
         <w:rPr>
           <w:rFonts w:ascii="Consolas" w:eastAsia="Times New Roman" w:hAnsi="Consolas" w:cs="Times New Roman"/>
@@ -1865,6 +1866,7 @@
         </w:rPr>
         <w:t>int</w:t>
       </w:r>
+      <w:proofErr w:type="spellEnd"/>
       <w:r>
         <w:rPr>
           <w:rFonts w:ascii="Consolas" w:eastAsia="Times New Roman" w:hAnsi="Consolas" w:cs="Times New Roman"/>
@@ -2504,6 +2506,7 @@
         </w:rPr>
         <w:t xml:space="preserve">  </w:t>
       </w:r>
+      <w:proofErr w:type="spellStart"/>
       <w:r>
         <w:rPr>
           <w:rFonts w:ascii="Consolas" w:eastAsia="Times New Roman" w:hAnsi="Consolas" w:cs="Times New Roman"/>
@@ -2514,6 +2517,7 @@
         </w:rPr>
         <w:t>int</w:t>
       </w:r>
+      <w:proofErr w:type="spellEnd"/>
       <w:r>
         <w:rPr>
           <w:rFonts w:ascii="Consolas" w:eastAsia="Times New Roman" w:hAnsi="Consolas" w:cs="Times New Roman"/>
@@ -4035,13 +4039,7 @@
         <w:rPr>
           <w:szCs w:val="24"/>
         </w:rPr>
-        <w:t>Exemplo do protótipo</w:t>
-      </w:r>
-      <w:r>
-        <w:rPr>
-          <w:szCs w:val="24"/>
-        </w:rPr>
-        <w:t>:</w:t>
+        <w:t>Exemplo do protótipo:</w:t>
       </w:r>
     </w:p>
     <w:p>
@@ -4054,6 +4052,15 @@
       </w:r>
       <w:r>
         <w:instrText xml:space="preserve"> INCLUDEPICTURE "https://circuitomaker.com/wp-content/uploads/2022/02/joystickarcadecircuitomaker.jpg" \* MERGEFORMATINET </w:instrText>
+      </w:r>
+      <w:r>
+        <w:fldChar w:fldCharType="separate"/>
+      </w:r>
+      <w:r>
+        <w:fldChar w:fldCharType="begin"/>
+      </w:r>
+      <w:r>
+        <w:instrText xml:space="preserve"> INCLUDEPICTURE  "https://circuitomaker.com/wp-content/uploads/2022/02/joystickarcadecircuitomaker.jpg" \* MERGEFORMATINET </w:instrText>
       </w:r>
       <w:r>
         <w:fldChar w:fldCharType="separate"/>
@@ -4083,6 +4090,9 @@
             <v:imagedata r:id="rId17" r:href="rId18"/>
           </v:shape>
         </w:pict>
+      </w:r>
+      <w:r>
+        <w:fldChar w:fldCharType="end"/>
       </w:r>
       <w:r>
         <w:fldChar w:fldCharType="end"/>
@@ -4323,42 +4333,7 @@
           <w:bCs/>
           <w:szCs w:val="24"/>
         </w:rPr>
-        <w:t>H</w:t>
-      </w:r>
-      <w:r>
-        <w:rPr>
-          <w:bCs/>
-          <w:szCs w:val="24"/>
-        </w:rPr>
-        <w:t xml:space="preserve">averá no mínimo 7 botões, uma manopla, </w:t>
-      </w:r>
-      <w:r>
-        <w:rPr>
-          <w:bCs/>
-          <w:szCs w:val="24"/>
-        </w:rPr>
-        <w:t xml:space="preserve">um Arduino </w:t>
-      </w:r>
-      <w:r>
-        <w:rPr>
-          <w:bCs/>
-          <w:szCs w:val="24"/>
-        </w:rPr>
-        <w:t>LEONARDO</w:t>
-      </w:r>
-      <w:r>
-        <w:rPr>
-          <w:bCs/>
-          <w:szCs w:val="24"/>
-        </w:rPr>
-        <w:t xml:space="preserve"> e jumpers Macho X Fêmea</w:t>
-      </w:r>
-      <w:r>
-        <w:rPr>
-          <w:bCs/>
-          <w:szCs w:val="24"/>
-        </w:rPr>
-        <w:t>.</w:t>
+        <w:t>Haverá no mínimo 7 botões, uma manopla, um Arduino LEONARDO e jumpers Macho X Fêmea.</w:t>
       </w:r>
     </w:p>
     <w:p>
@@ -4992,7 +4967,25 @@
           <w:sz w:val="20"/>
           <w:szCs w:val="20"/>
         </w:rPr>
-        <w:t>(ledsPins[x</w:t>
+        <w:t>(</w:t>
+      </w:r>
+      <w:proofErr w:type="spellStart"/>
+      <w:r>
+        <w:rPr>
+          <w:rFonts w:ascii="Consolas" w:hAnsi="Consolas"/>
+          <w:sz w:val="20"/>
+          <w:szCs w:val="20"/>
+        </w:rPr>
+        <w:t>ledsPins</w:t>
+      </w:r>
+      <w:proofErr w:type="spellEnd"/>
+      <w:r>
+        <w:rPr>
+          <w:rFonts w:ascii="Consolas" w:hAnsi="Consolas"/>
+          <w:sz w:val="20"/>
+          <w:szCs w:val="20"/>
+        </w:rPr>
+        <w:t>[x</w:t>
       </w:r>
       <w:proofErr w:type="gramStart"/>
       <w:r>
@@ -5064,7 +5057,25 @@
           <w:sz w:val="20"/>
           <w:szCs w:val="20"/>
         </w:rPr>
-        <w:t>(direcionalPins[x</w:t>
+        <w:t>(</w:t>
+      </w:r>
+      <w:proofErr w:type="spellStart"/>
+      <w:r>
+        <w:rPr>
+          <w:rFonts w:ascii="Consolas" w:hAnsi="Consolas"/>
+          <w:sz w:val="20"/>
+          <w:szCs w:val="20"/>
+        </w:rPr>
+        <w:t>direcionalPins</w:t>
+      </w:r>
+      <w:proofErr w:type="spellEnd"/>
+      <w:r>
+        <w:rPr>
+          <w:rFonts w:ascii="Consolas" w:hAnsi="Consolas"/>
+          <w:sz w:val="20"/>
+          <w:szCs w:val="20"/>
+        </w:rPr>
+        <w:t>[x</w:t>
       </w:r>
       <w:proofErr w:type="gramStart"/>
       <w:r>
@@ -5556,7 +5567,25 @@
           <w:sz w:val="20"/>
           <w:szCs w:val="20"/>
         </w:rPr>
-        <w:t>(ledsPins[x</w:t>
+        <w:t>(</w:t>
+      </w:r>
+      <w:proofErr w:type="spellStart"/>
+      <w:r>
+        <w:rPr>
+          <w:rFonts w:ascii="Consolas" w:hAnsi="Consolas"/>
+          <w:sz w:val="20"/>
+          <w:szCs w:val="20"/>
+        </w:rPr>
+        <w:t>ledsPins</w:t>
+      </w:r>
+      <w:proofErr w:type="spellEnd"/>
+      <w:r>
+        <w:rPr>
+          <w:rFonts w:ascii="Consolas" w:hAnsi="Consolas"/>
+          <w:sz w:val="20"/>
+          <w:szCs w:val="20"/>
+        </w:rPr>
+        <w:t>[x</w:t>
       </w:r>
       <w:proofErr w:type="gramStart"/>
       <w:r>
@@ -5721,7 +5750,25 @@
           <w:sz w:val="20"/>
           <w:szCs w:val="20"/>
         </w:rPr>
-        <w:t>(ledsPins[x</w:t>
+        <w:t>(</w:t>
+      </w:r>
+      <w:proofErr w:type="spellStart"/>
+      <w:r>
+        <w:rPr>
+          <w:rFonts w:ascii="Consolas" w:hAnsi="Consolas"/>
+          <w:sz w:val="20"/>
+          <w:szCs w:val="20"/>
+        </w:rPr>
+        <w:t>ledsPins</w:t>
+      </w:r>
+      <w:proofErr w:type="spellEnd"/>
+      <w:r>
+        <w:rPr>
+          <w:rFonts w:ascii="Consolas" w:hAnsi="Consolas"/>
+          <w:sz w:val="20"/>
+          <w:szCs w:val="20"/>
+        </w:rPr>
+        <w:t>[x</w:t>
       </w:r>
       <w:proofErr w:type="gramStart"/>
       <w:r>
@@ -6271,7 +6318,25 @@
           <w:sz w:val="20"/>
           <w:szCs w:val="20"/>
         </w:rPr>
-        <w:t>(direcionalPins[0</w:t>
+        <w:t>(</w:t>
+      </w:r>
+      <w:proofErr w:type="spellStart"/>
+      <w:r>
+        <w:rPr>
+          <w:rFonts w:ascii="Consolas" w:hAnsi="Consolas"/>
+          <w:sz w:val="20"/>
+          <w:szCs w:val="20"/>
+        </w:rPr>
+        <w:t>direcionalPins</w:t>
+      </w:r>
+      <w:proofErr w:type="spellEnd"/>
+      <w:r>
+        <w:rPr>
+          <w:rFonts w:ascii="Consolas" w:hAnsi="Consolas"/>
+          <w:sz w:val="20"/>
+          <w:szCs w:val="20"/>
+        </w:rPr>
+        <w:t>[0</w:t>
       </w:r>
       <w:proofErr w:type="gramStart"/>
       <w:r>
@@ -6379,7 +6444,25 @@
           <w:sz w:val="20"/>
           <w:szCs w:val="20"/>
         </w:rPr>
-        <w:t>(direcionalPins[1</w:t>
+        <w:t>(</w:t>
+      </w:r>
+      <w:proofErr w:type="spellStart"/>
+      <w:r>
+        <w:rPr>
+          <w:rFonts w:ascii="Consolas" w:hAnsi="Consolas"/>
+          <w:sz w:val="20"/>
+          <w:szCs w:val="20"/>
+        </w:rPr>
+        <w:t>direcionalPins</w:t>
+      </w:r>
+      <w:proofErr w:type="spellEnd"/>
+      <w:r>
+        <w:rPr>
+          <w:rFonts w:ascii="Consolas" w:hAnsi="Consolas"/>
+          <w:sz w:val="20"/>
+          <w:szCs w:val="20"/>
+        </w:rPr>
+        <w:t>[1</w:t>
       </w:r>
       <w:proofErr w:type="gramStart"/>
       <w:r>
@@ -6487,7 +6570,25 @@
           <w:sz w:val="20"/>
           <w:szCs w:val="20"/>
         </w:rPr>
-        <w:t>(direcionalPins[2</w:t>
+        <w:t>(</w:t>
+      </w:r>
+      <w:proofErr w:type="spellStart"/>
+      <w:r>
+        <w:rPr>
+          <w:rFonts w:ascii="Consolas" w:hAnsi="Consolas"/>
+          <w:sz w:val="20"/>
+          <w:szCs w:val="20"/>
+        </w:rPr>
+        <w:t>direcionalPins</w:t>
+      </w:r>
+      <w:proofErr w:type="spellEnd"/>
+      <w:r>
+        <w:rPr>
+          <w:rFonts w:ascii="Consolas" w:hAnsi="Consolas"/>
+          <w:sz w:val="20"/>
+          <w:szCs w:val="20"/>
+        </w:rPr>
+        <w:t>[2</w:t>
       </w:r>
       <w:proofErr w:type="gramStart"/>
       <w:r>
@@ -6595,7 +6696,25 @@
           <w:sz w:val="20"/>
           <w:szCs w:val="20"/>
         </w:rPr>
-        <w:t>(direcionalPins[3</w:t>
+        <w:t>(</w:t>
+      </w:r>
+      <w:proofErr w:type="spellStart"/>
+      <w:r>
+        <w:rPr>
+          <w:rFonts w:ascii="Consolas" w:hAnsi="Consolas"/>
+          <w:sz w:val="20"/>
+          <w:szCs w:val="20"/>
+        </w:rPr>
+        <w:t>direcionalPins</w:t>
+      </w:r>
+      <w:proofErr w:type="spellEnd"/>
+      <w:r>
+        <w:rPr>
+          <w:rFonts w:ascii="Consolas" w:hAnsi="Consolas"/>
+          <w:sz w:val="20"/>
+          <w:szCs w:val="20"/>
+        </w:rPr>
+        <w:t>[3</w:t>
       </w:r>
       <w:proofErr w:type="gramStart"/>
       <w:r>
@@ -7046,15 +7165,7 @@
           <w:szCs w:val="24"/>
         </w:rPr>
         <w:lastRenderedPageBreak/>
-        <w:t>Custos do projeto físico</w:t>
-      </w:r>
-      <w:r>
-        <w:rPr>
-          <w:b/>
-          <w:bCs/>
-          <w:szCs w:val="24"/>
-        </w:rPr>
-        <w:t xml:space="preserve"> (itens comprados até o momento)</w:t>
+        <w:t>Custos do projeto físico (itens comprados até o momento)</w:t>
       </w:r>
     </w:p>
     <w:tbl>
@@ -7212,15 +7323,7 @@
                 <w:bCs/>
                 <w:szCs w:val="24"/>
               </w:rPr>
-              <w:t xml:space="preserve">Arduino </w:t>
-            </w:r>
-            <w:r>
-              <w:rPr>
-                <w:b/>
-                <w:bCs/>
-                <w:szCs w:val="24"/>
-              </w:rPr>
-              <w:t>Leonardo</w:t>
+              <w:t>Arduino Leonardo</w:t>
             </w:r>
           </w:p>
         </w:tc>
@@ -7973,7 +8076,7 @@
           <w:szCs w:val="20"/>
         </w:rPr>
         <w:drawing>
-          <wp:inline distT="0" distB="0" distL="0" distR="0" wp14:anchorId="2F100FA9" wp14:editId="25039197">
+          <wp:inline distT="0" distB="0" distL="0" distR="0" wp14:anchorId="2F100FA9" wp14:editId="3116945A">
             <wp:extent cx="1949270" cy="3543300"/>
             <wp:effectExtent l="0" t="0" r="0" b="0"/>
             <wp:docPr id="2143359107" name="Imagem 2"/>
@@ -8019,6 +8122,234 @@
               </a:graphicData>
             </a:graphic>
           </wp:inline>
+        </w:drawing>
+      </w:r>
+    </w:p>
+    <w:p>
+      <w:pPr>
+        <w:rPr>
+          <w:sz w:val="20"/>
+          <w:szCs w:val="20"/>
+        </w:rPr>
+      </w:pPr>
+      <w:r>
+        <w:rPr>
+          <w:sz w:val="20"/>
+          <w:szCs w:val="20"/>
+        </w:rPr>
+        <w:br w:type="page"/>
+      </w:r>
+    </w:p>
+    <w:p>
+      <w:pPr>
+        <w:spacing w:after="0" w:line="360" w:lineRule="auto"/>
+        <w:jc w:val="both"/>
+        <w:rPr>
+          <w:b/>
+          <w:bCs/>
+          <w:szCs w:val="24"/>
+        </w:rPr>
+      </w:pPr>
+      <w:r>
+        <w:rPr>
+          <w:b/>
+          <w:bCs/>
+          <w:szCs w:val="24"/>
+        </w:rPr>
+        <w:lastRenderedPageBreak/>
+        <w:t>Fotos e vídeos do protótipo físico</w:t>
+      </w:r>
+    </w:p>
+    <w:p>
+      <w:pPr>
+        <w:spacing w:after="0" w:line="360" w:lineRule="auto"/>
+        <w:jc w:val="both"/>
+        <w:rPr>
+          <w:sz w:val="28"/>
+          <w:szCs w:val="28"/>
+        </w:rPr>
+      </w:pPr>
+      <w:r>
+        <w:rPr>
+          <w:noProof/>
+          <w:sz w:val="28"/>
+          <w:szCs w:val="28"/>
+        </w:rPr>
+        <w:drawing>
+          <wp:anchor distT="0" distB="0" distL="114300" distR="114300" simplePos="0" relativeHeight="251660288" behindDoc="0" locked="0" layoutInCell="1" allowOverlap="1" wp14:anchorId="46C0B968" wp14:editId="0EF03B10">
+            <wp:simplePos x="0" y="0"/>
+            <wp:positionH relativeFrom="margin">
+              <wp:posOffset>3156585</wp:posOffset>
+            </wp:positionH>
+            <wp:positionV relativeFrom="margin">
+              <wp:posOffset>313690</wp:posOffset>
+            </wp:positionV>
+            <wp:extent cx="2346960" cy="4472940"/>
+            <wp:effectExtent l="0" t="0" r="0" b="3810"/>
+            <wp:wrapSquare wrapText="bothSides"/>
+            <wp:docPr id="1818693250" name="Imagem 2"/>
+            <wp:cNvGraphicFramePr>
+              <a:graphicFrameLocks xmlns:a="http://schemas.openxmlformats.org/drawingml/2006/main" noChangeAspect="1"/>
+            </wp:cNvGraphicFramePr>
+            <a:graphic xmlns:a="http://schemas.openxmlformats.org/drawingml/2006/main">
+              <a:graphicData uri="http://schemas.openxmlformats.org/drawingml/2006/picture">
+                <pic:pic xmlns:pic="http://schemas.openxmlformats.org/drawingml/2006/picture">
+                  <pic:nvPicPr>
+                    <pic:cNvPr id="1818693250" name="Imagem 1818693250"/>
+                    <pic:cNvPicPr/>
+                  </pic:nvPicPr>
+                  <pic:blipFill>
+                    <a:blip r:embed="rId23" cstate="print">
+                      <a:extLst>
+                        <a:ext uri="{28A0092B-C50C-407E-A947-70E740481C1C}">
+                          <a14:useLocalDpi xmlns:a14="http://schemas.microsoft.com/office/drawing/2010/main" val="0"/>
+                        </a:ext>
+                      </a:extLst>
+                    </a:blip>
+                    <a:stretch>
+                      <a:fillRect/>
+                    </a:stretch>
+                  </pic:blipFill>
+                  <pic:spPr>
+                    <a:xfrm rot="10800000">
+                      <a:off x="0" y="0"/>
+                      <a:ext cx="2346960" cy="4472940"/>
+                    </a:xfrm>
+                    <a:prstGeom prst="rect">
+                      <a:avLst/>
+                    </a:prstGeom>
+                  </pic:spPr>
+                </pic:pic>
+              </a:graphicData>
+            </a:graphic>
+            <wp14:sizeRelH relativeFrom="margin">
+              <wp14:pctWidth>0</wp14:pctWidth>
+            </wp14:sizeRelH>
+            <wp14:sizeRelV relativeFrom="margin">
+              <wp14:pctHeight>0</wp14:pctHeight>
+            </wp14:sizeRelV>
+          </wp:anchor>
+        </w:drawing>
+      </w:r>
+      <w:r>
+        <w:rPr>
+          <w:noProof/>
+          <w:sz w:val="28"/>
+          <w:szCs w:val="28"/>
+        </w:rPr>
+        <w:drawing>
+          <wp:inline distT="0" distB="0" distL="0" distR="0" wp14:anchorId="06CC9291" wp14:editId="63FD7EA4">
+            <wp:extent cx="2571750" cy="4442281"/>
+            <wp:effectExtent l="0" t="0" r="0" b="0"/>
+            <wp:docPr id="410168868" name="Imagem 1"/>
+            <wp:cNvGraphicFramePr>
+              <a:graphicFrameLocks xmlns:a="http://schemas.openxmlformats.org/drawingml/2006/main" noChangeAspect="1"/>
+            </wp:cNvGraphicFramePr>
+            <a:graphic xmlns:a="http://schemas.openxmlformats.org/drawingml/2006/main">
+              <a:graphicData uri="http://schemas.openxmlformats.org/drawingml/2006/picture">
+                <pic:pic xmlns:pic="http://schemas.openxmlformats.org/drawingml/2006/picture">
+                  <pic:nvPicPr>
+                    <pic:cNvPr id="410168868" name="Imagem 410168868"/>
+                    <pic:cNvPicPr/>
+                  </pic:nvPicPr>
+                  <pic:blipFill>
+                    <a:blip r:embed="rId24" cstate="print">
+                      <a:extLst>
+                        <a:ext uri="{28A0092B-C50C-407E-A947-70E740481C1C}">
+                          <a14:useLocalDpi xmlns:a14="http://schemas.microsoft.com/office/drawing/2010/main" val="0"/>
+                        </a:ext>
+                      </a:extLst>
+                    </a:blip>
+                    <a:stretch>
+                      <a:fillRect/>
+                    </a:stretch>
+                  </pic:blipFill>
+                  <pic:spPr>
+                    <a:xfrm>
+                      <a:off x="0" y="0"/>
+                      <a:ext cx="2579532" cy="4455722"/>
+                    </a:xfrm>
+                    <a:prstGeom prst="rect">
+                      <a:avLst/>
+                    </a:prstGeom>
+                  </pic:spPr>
+                </pic:pic>
+              </a:graphicData>
+            </a:graphic>
+          </wp:inline>
+        </w:drawing>
+      </w:r>
+    </w:p>
+    <w:p>
+      <w:pPr>
+        <w:spacing w:after="0" w:line="360" w:lineRule="auto"/>
+        <w:jc w:val="both"/>
+        <w:rPr>
+          <w:sz w:val="28"/>
+          <w:szCs w:val="28"/>
+        </w:rPr>
+      </w:pPr>
+      <w:r>
+        <w:rPr>
+          <w:noProof/>
+          <w:sz w:val="28"/>
+          <w:szCs w:val="28"/>
+        </w:rPr>
+        <w:drawing>
+          <wp:anchor distT="0" distB="0" distL="114300" distR="114300" simplePos="0" relativeHeight="251661312" behindDoc="0" locked="0" layoutInCell="1" allowOverlap="1" wp14:anchorId="4C086434" wp14:editId="43D3CFCF">
+            <wp:simplePos x="1082040" y="5928360"/>
+            <wp:positionH relativeFrom="margin">
+              <wp:align>center</wp:align>
+            </wp:positionH>
+            <wp:positionV relativeFrom="margin">
+              <wp:align>bottom</wp:align>
+            </wp:positionV>
+            <wp:extent cx="4572000" cy="3429000"/>
+            <wp:effectExtent l="0" t="0" r="0" b="0"/>
+            <wp:wrapSquare wrapText="bothSides"/>
+            <wp:docPr id="1432986908" name="Vídeo 3" descr="Protótipo Físico - Vídeo 1 - Historiando">
+              <a:hlinkClick xmlns:a="http://schemas.openxmlformats.org/drawingml/2006/main" r:id="rId25"/>
+            </wp:docPr>
+            <wp:cNvGraphicFramePr>
+              <a:graphicFrameLocks xmlns:a="http://schemas.openxmlformats.org/drawingml/2006/main" noChangeAspect="1"/>
+            </wp:cNvGraphicFramePr>
+            <a:graphic xmlns:a="http://schemas.openxmlformats.org/drawingml/2006/main">
+              <a:graphicData uri="http://schemas.openxmlformats.org/drawingml/2006/picture">
+                <pic:pic xmlns:pic="http://schemas.openxmlformats.org/drawingml/2006/picture">
+                  <pic:nvPicPr>
+                    <pic:cNvPr id="1432986908" name="Vídeo 3" descr="Protótipo Físico - Vídeo 1 - Historiando">
+                      <a:hlinkClick r:id="rId25"/>
+                    </pic:cNvPr>
+                    <pic:cNvPicPr/>
+                  </pic:nvPicPr>
+                  <pic:blipFill>
+                    <a:blip r:embed="rId26">
+                      <a:extLst>
+                        <a:ext uri="{28A0092B-C50C-407E-A947-70E740481C1C}">
+                          <a14:useLocalDpi xmlns:a14="http://schemas.microsoft.com/office/drawing/2010/main" val="0"/>
+                        </a:ext>
+                        <a:ext uri="{C809E66F-F1BF-436E-b5F7-EEA9579F0CBA}">
+                          <wp15:webVideoPr xmlns:wp15="http://schemas.microsoft.com/office/word/2012/wordprocessingDrawing" embeddedHtml="&lt;iframe width=&quot;113&quot; height=&quot;200&quot; src=&quot;https://www.youtube.com/embed/mj1eX31Pmjw?feature=oembed&quot; frameborder=&quot;0&quot; allow=&quot;accelerometer; autoplay; clipboard-write; encrypted-media; gyroscope; picture-in-picture; web-share&quot; referrerpolicy=&quot;strict-origin-when-cross-origin&quot; allowfullscreen=&quot;&quot; title=&quot;Protótipo Físico - Vídeo 1 - Historiando&quot; sandbox=&quot;allow-scripts allow-same-origin allow-popups&quot;&gt;&lt;/iframe&gt;" h="200" w="113"/>
+                        </a:ext>
+                      </a:extLst>
+                    </a:blip>
+                    <a:stretch>
+                      <a:fillRect/>
+                    </a:stretch>
+                  </pic:blipFill>
+                  <pic:spPr>
+                    <a:xfrm>
+                      <a:off x="0" y="0"/>
+                      <a:ext cx="4572000" cy="3429000"/>
+                    </a:xfrm>
+                    <a:prstGeom prst="rect">
+                      <a:avLst/>
+                    </a:prstGeom>
+                  </pic:spPr>
+                </pic:pic>
+              </a:graphicData>
+            </a:graphic>
+          </wp:anchor>
         </w:drawing>
       </w:r>
     </w:p>
@@ -8764,6 +9095,7 @@
   <w:style w:type="character" w:default="1" w:styleId="Fontepargpadro">
     <w:name w:val="Default Paragraph Font"/>
     <w:uiPriority w:val="1"/>
+    <w:semiHidden/>
     <w:unhideWhenUsed/>
   </w:style>
   <w:style w:type="table" w:default="1" w:styleId="Tabelanormal">
@@ -9370,6 +9702,19 @@
 </file>
 
 <file path=customXml/item2.xml><?xml version="1.0" encoding="utf-8"?>
+<b:Sources xmlns:b="http://schemas.openxmlformats.org/officeDocument/2006/bibliography" xmlns="http://schemas.openxmlformats.org/officeDocument/2006/bibliography" SelectedStyle="\APASixthEditionOfficeOnline.xsl" StyleName="APA" Version="6"/>
+</file>
+
+<file path=customXml/item3.xml><?xml version="1.0" encoding="utf-8"?>
+<?mso-contentType ?>
+<FormTemplates xmlns="http://schemas.microsoft.com/sharepoint/v3/contenttype/forms">
+  <Display>DocumentLibraryForm</Display>
+  <Edit>DocumentLibraryForm</Edit>
+  <New>DocumentLibraryForm</New>
+</FormTemplates>
+</file>
+
+<file path=customXml/item4.xml><?xml version="1.0" encoding="utf-8"?>
 <ct:contentTypeSchema xmlns:ct="http://schemas.microsoft.com/office/2006/metadata/contentType" xmlns:ma="http://schemas.microsoft.com/office/2006/metadata/properties/metaAttributes" ct:_="" ma:_="" ma:contentTypeName="Documento" ma:contentTypeID="0x010100A192A8DA7517F145A9E0216687ED31D7" ma:contentTypeVersion="1" ma:contentTypeDescription="Crie um novo documento." ma:contentTypeScope="" ma:versionID="9f5fa407a8b3614354e067d3bc9b1bfc">
   <xsd:schema xmlns:xsd="http://www.w3.org/2001/XMLSchema" xmlns:xs="http://www.w3.org/2001/XMLSchema" xmlns:p="http://schemas.microsoft.com/office/2006/metadata/properties" xmlns:ns2="21e0ce27-b0e2-41aa-a79b-741a4637cbb0" targetNamespace="http://schemas.microsoft.com/office/2006/metadata/properties" ma:root="true" ma:fieldsID="7513b413246562f78619acd09f2e9488" ns2:_="">
     <xsd:import namespace="21e0ce27-b0e2-41aa-a79b-741a4637cbb0"/>
@@ -9495,19 +9840,6 @@
 </ct:contentTypeSchema>
 </file>
 
-<file path=customXml/item3.xml><?xml version="1.0" encoding="utf-8"?>
-<?mso-contentType ?>
-<FormTemplates xmlns="http://schemas.microsoft.com/sharepoint/v3/contenttype/forms">
-  <Display>DocumentLibraryForm</Display>
-  <Edit>DocumentLibraryForm</Edit>
-  <New>DocumentLibraryForm</New>
-</FormTemplates>
-</file>
-
-<file path=customXml/item4.xml><?xml version="1.0" encoding="utf-8"?>
-<b:Sources xmlns:b="http://schemas.openxmlformats.org/officeDocument/2006/bibliography" xmlns="http://schemas.openxmlformats.org/officeDocument/2006/bibliography" SelectedStyle="\APASixthEditionOfficeOnline.xsl" StyleName="APA" Version="6"/>
-</file>
-
 <file path=customXml/itemProps1.xml><?xml version="1.0" encoding="utf-8"?>
 <ds:datastoreItem xmlns:ds="http://schemas.openxmlformats.org/officeDocument/2006/customXml" ds:itemID="{5FE6D219-976A-4CE1-9EDB-A109B2021195}">
   <ds:schemaRefs>
@@ -9519,6 +9851,22 @@
 </file>
 
 <file path=customXml/itemProps2.xml><?xml version="1.0" encoding="utf-8"?>
+<ds:datastoreItem xmlns:ds="http://schemas.openxmlformats.org/officeDocument/2006/customXml" ds:itemID="{C7171C10-B272-4A46-943A-6C5E77F1B20E}">
+  <ds:schemaRefs>
+    <ds:schemaRef ds:uri="http://schemas.openxmlformats.org/officeDocument/2006/bibliography"/>
+  </ds:schemaRefs>
+</ds:datastoreItem>
+</file>
+
+<file path=customXml/itemProps3.xml><?xml version="1.0" encoding="utf-8"?>
+<ds:datastoreItem xmlns:ds="http://schemas.openxmlformats.org/officeDocument/2006/customXml" ds:itemID="{3091FFD0-3601-428E-B685-84AFEE0B15BE}">
+  <ds:schemaRefs>
+    <ds:schemaRef ds:uri="http://schemas.microsoft.com/sharepoint/v3/contenttype/forms"/>
+  </ds:schemaRefs>
+</ds:datastoreItem>
+</file>
+
+<file path=customXml/itemProps4.xml><?xml version="1.0" encoding="utf-8"?>
 <ds:datastoreItem xmlns:ds="http://schemas.openxmlformats.org/officeDocument/2006/customXml" ds:itemID="{B91B99C2-1393-47E3-B4C0-ED746EF5618E}">
   <ds:schemaRefs>
     <ds:schemaRef ds:uri="http://schemas.microsoft.com/office/2006/metadata/contentType"/>
@@ -9534,20 +9882,4 @@
     <ds:schemaRef ds:uri="http://schemas.microsoft.com/internal/obd"/>
   </ds:schemaRefs>
 </ds:datastoreItem>
-</file>
-
-<file path=customXml/itemProps3.xml><?xml version="1.0" encoding="utf-8"?>
-<ds:datastoreItem xmlns:ds="http://schemas.openxmlformats.org/officeDocument/2006/customXml" ds:itemID="{3091FFD0-3601-428E-B685-84AFEE0B15BE}">
-  <ds:schemaRefs>
-    <ds:schemaRef ds:uri="http://schemas.microsoft.com/sharepoint/v3/contenttype/forms"/>
-  </ds:schemaRefs>
-</ds:datastoreItem>
-</file>
-
-<file path=customXml/itemProps4.xml><?xml version="1.0" encoding="utf-8"?>
-<ds:datastoreItem xmlns:ds="http://schemas.openxmlformats.org/officeDocument/2006/customXml" ds:itemID="{C7171C10-B272-4A46-943A-6C5E77F1B20E}">
-  <ds:schemaRefs>
-    <ds:schemaRef ds:uri="http://schemas.openxmlformats.org/officeDocument/2006/bibliography"/>
-  </ds:schemaRefs>
-</ds:datastoreItem>
 </file>
</xml_diff>

<commit_message>
[update] Add link do vídeo
</commit_message>
<xml_diff>
--- a/2026/trabalhos/TCC/Sistemas_Embarcados_HistoriandoFinal2.0.docx
+++ b/2026/trabalhos/TCC/Sistemas_Embarcados_HistoriandoFinal2.0.docx
@@ -1,6 +1,6 @@
 
 <file path=word/document.xml><?xml version="1.0" encoding="utf-8"?>
-<w:document xmlns:wpc="http://schemas.microsoft.com/office/word/2010/wordprocessingCanvas" xmlns:cx="http://schemas.microsoft.com/office/drawing/2014/chartex" xmlns:cx1="http://schemas.microsoft.com/office/drawing/2015/9/8/chartex" xmlns:cx2="http://schemas.microsoft.com/office/drawing/2015/10/21/chartex" xmlns:cx3="http://schemas.microsoft.com/office/drawing/2016/5/9/chartex" xmlns:cx4="http://schemas.microsoft.com/office/drawing/2016/5/10/chartex" xmlns:cx5="http://schemas.microsoft.com/office/drawing/2016/5/11/chartex" xmlns:cx6="http://schemas.microsoft.com/office/drawing/2016/5/12/chartex" xmlns:cx7="http://schemas.microsoft.com/office/drawing/2016/5/13/chartex" xmlns:cx8="http://schemas.microsoft.com/office/drawing/2016/5/14/chartex" xmlns:mc="http://schemas.openxmlformats.org/markup-compatibility/2006" xmlns:aink="http://schemas.microsoft.com/office/drawing/2016/ink" xmlns:am3d="http://schemas.microsoft.com/office/drawing/2017/model3d" xmlns:o="urn:schemas-microsoft-com:office:office" xmlns:oel="http://schemas.microsoft.com/office/2019/extlst" xmlns:r="http://schemas.openxmlformats.org/officeDocument/2006/relationships" xmlns:m="http://schemas.openxmlformats.org/officeDocument/2006/math" xmlns:v="urn:schemas-microsoft-com:vml" xmlns:wp14="http://schemas.microsoft.com/office/word/2010/wordprocessingDrawing" xmlns:wp="http://schemas.openxmlformats.org/drawingml/2006/wordprocessingDrawing" xmlns:w10="urn:schemas-microsoft-com:office:word" xmlns:w="http://schemas.openxmlformats.org/wordprocessingml/2006/main" xmlns:w14="http://schemas.microsoft.com/office/word/2010/wordml" xmlns:w15="http://schemas.microsoft.com/office/word/2012/wordml" xmlns:w16cex="http://schemas.microsoft.com/office/word/2018/wordml/cex" xmlns:w16cid="http://schemas.microsoft.com/office/word/2016/wordml/cid" xmlns:w16="http://schemas.microsoft.com/office/word/2018/wordml" xmlns:w16du="http://schemas.microsoft.com/office/word/2023/wordml/word16du" xmlns:w16sdtdh="http://schemas.microsoft.com/office/word/2020/wordml/sdtdatahash" xmlns:w16sdtfl="http://schemas.microsoft.com/office/word/2024/wordml/sdtformatlock" xmlns:w16se="http://schemas.microsoft.com/office/word/2015/wordml/symex" xmlns:wpg="http://schemas.microsoft.com/office/word/2010/wordprocessingGroup" xmlns:wpi="http://schemas.microsoft.com/office/word/2010/wordprocessingInk" xmlns:wne="http://schemas.microsoft.com/office/word/2006/wordml" xmlns:wps="http://schemas.microsoft.com/office/word/2010/wordprocessingShape" mc:Ignorable="w14 w15 w16se w16cid w16 w16cex w16sdtdh w16sdtfl w16du wp14">
+<w:document xmlns:wpc="http://schemas.microsoft.com/office/word/2010/wordprocessingCanvas" xmlns:cx="http://schemas.microsoft.com/office/drawing/2014/chartex" xmlns:mc="http://schemas.openxmlformats.org/markup-compatibility/2006" xmlns:o="urn:schemas-microsoft-com:office:office" xmlns:r="http://schemas.openxmlformats.org/officeDocument/2006/relationships" xmlns:m="http://schemas.openxmlformats.org/officeDocument/2006/math" xmlns:v="urn:schemas-microsoft-com:vml" xmlns:wp14="http://schemas.microsoft.com/office/word/2010/wordprocessingDrawing" xmlns:wp="http://schemas.openxmlformats.org/drawingml/2006/wordprocessingDrawing" xmlns:w10="urn:schemas-microsoft-com:office:word" xmlns:w="http://schemas.openxmlformats.org/wordprocessingml/2006/main" xmlns:w14="http://schemas.microsoft.com/office/word/2010/wordml" xmlns:w15="http://schemas.microsoft.com/office/word/2012/wordml" xmlns:w16se="http://schemas.microsoft.com/office/word/2015/wordml/symex" xmlns:wpg="http://schemas.microsoft.com/office/word/2010/wordprocessingGroup" xmlns:wpi="http://schemas.microsoft.com/office/word/2010/wordprocessingInk" xmlns:wne="http://schemas.microsoft.com/office/word/2006/wordml" xmlns:wps="http://schemas.microsoft.com/office/word/2010/wordprocessingShape" mc:Ignorable="w14 w15 w16se wp14">
   <w:body>
     <w:p>
       <w:pPr>
@@ -1355,6 +1355,7 @@
           <w:lang w:eastAsia="pt-BR"/>
         </w:rPr>
       </w:pPr>
+      <w:proofErr w:type="gramStart"/>
       <w:r>
         <w:rPr>
           <w:rFonts w:ascii="Consolas" w:eastAsia="Times New Roman" w:hAnsi="Consolas" w:cs="Times New Roman"/>
@@ -1365,6 +1366,7 @@
         </w:rPr>
         <w:t>void</w:t>
       </w:r>
+      <w:proofErr w:type="gramEnd"/>
       <w:r>
         <w:rPr>
           <w:rFonts w:ascii="Consolas" w:eastAsia="Times New Roman" w:hAnsi="Consolas" w:cs="Times New Roman"/>
@@ -1375,7 +1377,6 @@
         </w:rPr>
         <w:t xml:space="preserve"> </w:t>
       </w:r>
-      <w:proofErr w:type="gramStart"/>
       <w:r>
         <w:rPr>
           <w:rFonts w:ascii="Consolas" w:eastAsia="Times New Roman" w:hAnsi="Consolas" w:cs="Times New Roman"/>
@@ -1394,18 +1395,7 @@
           <w:szCs w:val="21"/>
           <w:lang w:eastAsia="pt-BR"/>
         </w:rPr>
-        <w:t>(</w:t>
-      </w:r>
-      <w:proofErr w:type="gramEnd"/>
-      <w:r>
-        <w:rPr>
-          <w:rFonts w:ascii="Consolas" w:eastAsia="Times New Roman" w:hAnsi="Consolas" w:cs="Times New Roman"/>
-          <w:color w:val="000000"/>
-          <w:sz w:val="21"/>
-          <w:szCs w:val="21"/>
-          <w:lang w:eastAsia="pt-BR"/>
-        </w:rPr>
-        <w:t>) {</w:t>
+        <w:t>() {</w:t>
       </w:r>
     </w:p>
     <w:p>
@@ -1945,6 +1935,7 @@
           <w:lang w:eastAsia="pt-BR"/>
         </w:rPr>
       </w:pPr>
+      <w:proofErr w:type="gramStart"/>
       <w:r>
         <w:rPr>
           <w:rFonts w:ascii="Consolas" w:eastAsia="Times New Roman" w:hAnsi="Consolas" w:cs="Times New Roman"/>
@@ -1955,6 +1946,7 @@
         </w:rPr>
         <w:t>void</w:t>
       </w:r>
+      <w:proofErr w:type="gramEnd"/>
       <w:r>
         <w:rPr>
           <w:rFonts w:ascii="Consolas" w:eastAsia="Times New Roman" w:hAnsi="Consolas" w:cs="Times New Roman"/>
@@ -1965,7 +1957,6 @@
         </w:rPr>
         <w:t xml:space="preserve"> </w:t>
       </w:r>
-      <w:proofErr w:type="gramStart"/>
       <w:r>
         <w:rPr>
           <w:rFonts w:ascii="Consolas" w:eastAsia="Times New Roman" w:hAnsi="Consolas" w:cs="Times New Roman"/>
@@ -1984,18 +1975,7 @@
           <w:szCs w:val="21"/>
           <w:lang w:eastAsia="pt-BR"/>
         </w:rPr>
-        <w:t>(</w:t>
-      </w:r>
-      <w:proofErr w:type="gramEnd"/>
-      <w:r>
-        <w:rPr>
-          <w:rFonts w:ascii="Consolas" w:eastAsia="Times New Roman" w:hAnsi="Consolas" w:cs="Times New Roman"/>
-          <w:color w:val="000000"/>
-          <w:sz w:val="21"/>
-          <w:szCs w:val="21"/>
-          <w:lang w:eastAsia="pt-BR"/>
-        </w:rPr>
-        <w:t>) {</w:t>
+        <w:t>() {</w:t>
       </w:r>
     </w:p>
     <w:p>
@@ -2507,6 +2487,7 @@
         <w:t xml:space="preserve">  </w:t>
       </w:r>
       <w:proofErr w:type="spellStart"/>
+      <w:proofErr w:type="gramStart"/>
       <w:r>
         <w:rPr>
           <w:rFonts w:ascii="Consolas" w:eastAsia="Times New Roman" w:hAnsi="Consolas" w:cs="Times New Roman"/>
@@ -2516,61 +2497,6 @@
           <w:lang w:eastAsia="pt-BR"/>
         </w:rPr>
         <w:t>int</w:t>
-      </w:r>
-      <w:proofErr w:type="spellEnd"/>
-      <w:r>
-        <w:rPr>
-          <w:rFonts w:ascii="Consolas" w:eastAsia="Times New Roman" w:hAnsi="Consolas" w:cs="Times New Roman"/>
-          <w:color w:val="000000"/>
-          <w:sz w:val="21"/>
-          <w:szCs w:val="21"/>
-          <w:lang w:eastAsia="pt-BR"/>
-        </w:rPr>
-        <w:t xml:space="preserve"> </w:t>
-      </w:r>
-      <w:proofErr w:type="spellStart"/>
-      <w:r>
-        <w:rPr>
-          <w:rFonts w:ascii="Consolas" w:eastAsia="Times New Roman" w:hAnsi="Consolas" w:cs="Times New Roman"/>
-          <w:color w:val="000000"/>
-          <w:sz w:val="21"/>
-          <w:szCs w:val="21"/>
-          <w:lang w:eastAsia="pt-BR"/>
-        </w:rPr>
-        <w:t>currentButtonState</w:t>
-      </w:r>
-      <w:proofErr w:type="spellEnd"/>
-      <w:r>
-        <w:rPr>
-          <w:rFonts w:ascii="Consolas" w:eastAsia="Times New Roman" w:hAnsi="Consolas" w:cs="Times New Roman"/>
-          <w:color w:val="000000"/>
-          <w:sz w:val="21"/>
-          <w:szCs w:val="21"/>
-          <w:lang w:eastAsia="pt-BR"/>
-        </w:rPr>
-        <w:t xml:space="preserve"> </w:t>
-      </w:r>
-      <w:proofErr w:type="gramStart"/>
-      <w:r>
-        <w:rPr>
-          <w:rFonts w:ascii="Consolas" w:eastAsia="Times New Roman" w:hAnsi="Consolas" w:cs="Times New Roman"/>
-          <w:color w:val="000000"/>
-          <w:sz w:val="21"/>
-          <w:szCs w:val="21"/>
-          <w:lang w:eastAsia="pt-BR"/>
-        </w:rPr>
-        <w:t>= !</w:t>
-      </w:r>
-      <w:proofErr w:type="spellStart"/>
-      <w:r>
-        <w:rPr>
-          <w:rFonts w:ascii="Consolas" w:eastAsia="Times New Roman" w:hAnsi="Consolas" w:cs="Times New Roman"/>
-          <w:color w:val="E97366"/>
-          <w:sz w:val="21"/>
-          <w:szCs w:val="21"/>
-          <w:lang w:eastAsia="pt-BR"/>
-        </w:rPr>
-        <w:t>digitalRead</w:t>
       </w:r>
       <w:proofErr w:type="spellEnd"/>
       <w:proofErr w:type="gramEnd"/>
@@ -2582,6 +2508,50 @@
           <w:szCs w:val="21"/>
           <w:lang w:eastAsia="pt-BR"/>
         </w:rPr>
+        <w:t xml:space="preserve"> </w:t>
+      </w:r>
+      <w:proofErr w:type="spellStart"/>
+      <w:r>
+        <w:rPr>
+          <w:rFonts w:ascii="Consolas" w:eastAsia="Times New Roman" w:hAnsi="Consolas" w:cs="Times New Roman"/>
+          <w:color w:val="000000"/>
+          <w:sz w:val="21"/>
+          <w:szCs w:val="21"/>
+          <w:lang w:eastAsia="pt-BR"/>
+        </w:rPr>
+        <w:t>currentButtonState</w:t>
+      </w:r>
+      <w:proofErr w:type="spellEnd"/>
+      <w:r>
+        <w:rPr>
+          <w:rFonts w:ascii="Consolas" w:eastAsia="Times New Roman" w:hAnsi="Consolas" w:cs="Times New Roman"/>
+          <w:color w:val="000000"/>
+          <w:sz w:val="21"/>
+          <w:szCs w:val="21"/>
+          <w:lang w:eastAsia="pt-BR"/>
+        </w:rPr>
+        <w:t xml:space="preserve"> = !</w:t>
+      </w:r>
+      <w:proofErr w:type="spellStart"/>
+      <w:r>
+        <w:rPr>
+          <w:rFonts w:ascii="Consolas" w:eastAsia="Times New Roman" w:hAnsi="Consolas" w:cs="Times New Roman"/>
+          <w:color w:val="E97366"/>
+          <w:sz w:val="21"/>
+          <w:szCs w:val="21"/>
+          <w:lang w:eastAsia="pt-BR"/>
+        </w:rPr>
+        <w:t>digitalRead</w:t>
+      </w:r>
+      <w:proofErr w:type="spellEnd"/>
+      <w:r>
+        <w:rPr>
+          <w:rFonts w:ascii="Consolas" w:eastAsia="Times New Roman" w:hAnsi="Consolas" w:cs="Times New Roman"/>
+          <w:color w:val="000000"/>
+          <w:sz w:val="21"/>
+          <w:szCs w:val="21"/>
+          <w:lang w:eastAsia="pt-BR"/>
+        </w:rPr>
         <w:t>(</w:t>
       </w:r>
       <w:r>
@@ -2664,6 +2634,7 @@
         <w:t xml:space="preserve">  </w:t>
       </w:r>
       <w:proofErr w:type="spellStart"/>
+      <w:proofErr w:type="gramStart"/>
       <w:r>
         <w:rPr>
           <w:rFonts w:ascii="Consolas" w:eastAsia="Times New Roman" w:hAnsi="Consolas" w:cs="Times New Roman"/>
@@ -2675,6 +2646,7 @@
         <w:t>if</w:t>
       </w:r>
       <w:proofErr w:type="spellEnd"/>
+      <w:proofErr w:type="gramEnd"/>
       <w:r>
         <w:rPr>
           <w:rFonts w:ascii="Consolas" w:eastAsia="Times New Roman" w:hAnsi="Consolas" w:cs="Times New Roman"/>
@@ -2686,7 +2658,6 @@
         <w:t xml:space="preserve"> (</w:t>
       </w:r>
       <w:proofErr w:type="spellStart"/>
-      <w:proofErr w:type="gramStart"/>
       <w:r>
         <w:rPr>
           <w:rFonts w:ascii="Consolas" w:eastAsia="Times New Roman" w:hAnsi="Consolas" w:cs="Times New Roman"/>
@@ -2706,18 +2677,7 @@
           <w:szCs w:val="21"/>
           <w:lang w:eastAsia="pt-BR"/>
         </w:rPr>
-        <w:t xml:space="preserve"> !</w:t>
-      </w:r>
-      <w:proofErr w:type="gramEnd"/>
-      <w:r>
-        <w:rPr>
-          <w:rFonts w:ascii="Consolas" w:eastAsia="Times New Roman" w:hAnsi="Consolas" w:cs="Times New Roman"/>
-          <w:color w:val="000000"/>
-          <w:sz w:val="21"/>
-          <w:szCs w:val="21"/>
-          <w:lang w:eastAsia="pt-BR"/>
-        </w:rPr>
-        <w:t xml:space="preserve">= </w:t>
+        <w:t xml:space="preserve"> != </w:t>
       </w:r>
       <w:proofErr w:type="spellStart"/>
       <w:r>
@@ -3915,21 +3875,7 @@
         <w:rPr>
           <w:szCs w:val="24"/>
         </w:rPr>
-        <w:t xml:space="preserve">, ou seja, possui algum tipo de deficiência, que pode ser de nascimento ou adquirida durante a vida. Já esse número ao redor do mundo chega </w:t>
-      </w:r>
-      <w:proofErr w:type="gramStart"/>
-      <w:r>
-        <w:rPr>
-          <w:szCs w:val="24"/>
-        </w:rPr>
-        <w:t>a</w:t>
-      </w:r>
-      <w:proofErr w:type="gramEnd"/>
-      <w:r>
-        <w:rPr>
-          <w:szCs w:val="24"/>
-        </w:rPr>
-        <w:t xml:space="preserve"> marca de 1 bilhão de pessoas </w:t>
+        <w:t xml:space="preserve">, ou seja, possui algum tipo de deficiência, que pode ser de nascimento ou adquirida durante a vida. Já esse número ao redor do mundo chega a marca de 1 bilhão de pessoas </w:t>
       </w:r>
       <w:proofErr w:type="spellStart"/>
       <w:r>
@@ -4061,6 +4007,21 @@
       </w:r>
       <w:r>
         <w:instrText xml:space="preserve"> INCLUDEPICTURE  "https://circuitomaker.com/wp-content/uploads/2022/02/joystickarcadecircuitomaker.jpg" \* MERGEFORMATINET </w:instrText>
+      </w:r>
+      <w:r>
+        <w:fldChar w:fldCharType="separate"/>
+      </w:r>
+      <w:r>
+        <w:fldChar w:fldCharType="begin"/>
+      </w:r>
+      <w:r>
+        <w:instrText xml:space="preserve"> </w:instrText>
+      </w:r>
+      <w:r>
+        <w:instrText>INCLUDEPICTURE  "https://circuitomaker.com/wp-content/uploads/2022/02/joystickarcadecircuitomaker.jpg" \* MERGEFORMATINET</w:instrText>
+      </w:r>
+      <w:r>
+        <w:instrText xml:space="preserve"> </w:instrText>
       </w:r>
       <w:r>
         <w:fldChar w:fldCharType="separate"/>
@@ -4097,6 +4058,9 @@
       <w:r>
         <w:fldChar w:fldCharType="end"/>
       </w:r>
+      <w:r>
+        <w:fldChar w:fldCharType="end"/>
+      </w:r>
     </w:p>
     <w:p>
       <w:pPr>
@@ -4209,6 +4173,7 @@
           <w:noProof/>
           <w:sz w:val="20"/>
           <w:szCs w:val="20"/>
+          <w:lang w:eastAsia="pt-BR"/>
         </w:rPr>
         <w:drawing>
           <wp:anchor distT="0" distB="0" distL="114300" distR="114300" simplePos="0" relativeHeight="251658240" behindDoc="0" locked="0" layoutInCell="1" allowOverlap="1" wp14:anchorId="5F8DFA0E" wp14:editId="732DF9BE">
@@ -4736,6 +4701,7 @@
         <w:t>   </w:t>
       </w:r>
       <w:proofErr w:type="spellStart"/>
+      <w:proofErr w:type="gramStart"/>
       <w:r>
         <w:rPr>
           <w:rFonts w:ascii="Consolas" w:hAnsi="Consolas"/>
@@ -4751,8 +4717,54 @@
           <w:sz w:val="20"/>
           <w:szCs w:val="20"/>
         </w:rPr>
-        <w:t>(botoes1Pins[x</w:t>
-      </w:r>
+        <w:t>(</w:t>
+      </w:r>
+      <w:proofErr w:type="gramEnd"/>
+      <w:r>
+        <w:rPr>
+          <w:rFonts w:ascii="Consolas" w:hAnsi="Consolas"/>
+          <w:sz w:val="20"/>
+          <w:szCs w:val="20"/>
+        </w:rPr>
+        <w:t xml:space="preserve">botoes1Pins[x],INPUT_PULLUP);    // Declara todos os pinos dos </w:t>
+      </w:r>
+      <w:proofErr w:type="spellStart"/>
+      <w:r>
+        <w:rPr>
+          <w:rFonts w:ascii="Consolas" w:hAnsi="Consolas"/>
+          <w:sz w:val="20"/>
+          <w:szCs w:val="20"/>
+        </w:rPr>
+        <w:t>botoes</w:t>
+      </w:r>
+      <w:proofErr w:type="spellEnd"/>
+      <w:r>
+        <w:rPr>
+          <w:rFonts w:ascii="Consolas" w:hAnsi="Consolas"/>
+          <w:sz w:val="20"/>
+          <w:szCs w:val="20"/>
+        </w:rPr>
+        <w:t xml:space="preserve"> 1 como entrada e ativa os resistores de "PULL UP" internos</w:t>
+      </w:r>
+    </w:p>
+    <w:p>
+      <w:pPr>
+        <w:spacing w:after="0" w:line="276" w:lineRule="auto"/>
+        <w:rPr>
+          <w:rFonts w:ascii="Consolas" w:hAnsi="Consolas"/>
+          <w:sz w:val="20"/>
+          <w:szCs w:val="20"/>
+        </w:rPr>
+      </w:pPr>
+      <w:r>
+        <w:rPr>
+          <w:rFonts w:ascii="Consolas" w:hAnsi="Consolas"/>
+          <w:sz w:val="20"/>
+          <w:szCs w:val="20"/>
+        </w:rPr>
+        <w:t>   </w:t>
+      </w:r>
+      <w:proofErr w:type="spellStart"/>
       <w:proofErr w:type="gramStart"/>
       <w:r>
         <w:rPr>
@@ -4760,7 +4772,16 @@
           <w:sz w:val="20"/>
           <w:szCs w:val="20"/>
         </w:rPr>
-        <w:t>],INPUT</w:t>
+        <w:t>pinMode</w:t>
+      </w:r>
+      <w:proofErr w:type="spellEnd"/>
+      <w:r>
+        <w:rPr>
+          <w:rFonts w:ascii="Consolas" w:hAnsi="Consolas"/>
+          <w:sz w:val="20"/>
+          <w:szCs w:val="20"/>
+        </w:rPr>
+        <w:t>(</w:t>
       </w:r>
       <w:proofErr w:type="gramEnd"/>
       <w:r>
@@ -4769,8 +4790,45 @@
           <w:sz w:val="20"/>
           <w:szCs w:val="20"/>
         </w:rPr>
-        <w:t>_PULLUP</w:t>
-      </w:r>
+        <w:t xml:space="preserve">botoes2Pins[x],INPUT_PULLUP);    // Declara todos os pinos dos </w:t>
+      </w:r>
+      <w:proofErr w:type="spellStart"/>
+      <w:r>
+        <w:rPr>
+          <w:rFonts w:ascii="Consolas" w:hAnsi="Consolas"/>
+          <w:sz w:val="20"/>
+          <w:szCs w:val="20"/>
+        </w:rPr>
+        <w:t>botoes</w:t>
+      </w:r>
+      <w:proofErr w:type="spellEnd"/>
+      <w:r>
+        <w:rPr>
+          <w:rFonts w:ascii="Consolas" w:hAnsi="Consolas"/>
+          <w:sz w:val="20"/>
+          <w:szCs w:val="20"/>
+        </w:rPr>
+        <w:t xml:space="preserve"> 2 como entrada e ativa os resistores de "PULL UP" internos</w:t>
+      </w:r>
+    </w:p>
+    <w:p>
+      <w:pPr>
+        <w:spacing w:after="0" w:line="276" w:lineRule="auto"/>
+        <w:rPr>
+          <w:rFonts w:ascii="Consolas" w:hAnsi="Consolas"/>
+          <w:sz w:val="20"/>
+          <w:szCs w:val="20"/>
+        </w:rPr>
+      </w:pPr>
+      <w:r>
+        <w:rPr>
+          <w:rFonts w:ascii="Consolas" w:hAnsi="Consolas"/>
+          <w:sz w:val="20"/>
+          <w:szCs w:val="20"/>
+        </w:rPr>
+        <w:t>   </w:t>
+      </w:r>
+      <w:proofErr w:type="spellStart"/>
       <w:proofErr w:type="gramStart"/>
       <w:r>
         <w:rPr>
@@ -4778,8 +4836,18 @@
           <w:sz w:val="20"/>
           <w:szCs w:val="20"/>
         </w:rPr>
-        <w:t xml:space="preserve">);   </w:t>
-      </w:r>
+        <w:t>pinMode</w:t>
+      </w:r>
+      <w:proofErr w:type="spellEnd"/>
+      <w:r>
+        <w:rPr>
+          <w:rFonts w:ascii="Consolas" w:hAnsi="Consolas"/>
+          <w:sz w:val="20"/>
+          <w:szCs w:val="20"/>
+        </w:rPr>
+        <w:t>(</w:t>
+      </w:r>
+      <w:proofErr w:type="spellStart"/>
       <w:proofErr w:type="gramEnd"/>
       <w:r>
         <w:rPr>
@@ -4787,8 +4855,36 @@
           <w:sz w:val="20"/>
           <w:szCs w:val="20"/>
         </w:rPr>
-        <w:t xml:space="preserve"> // </w:t>
-      </w:r>
+        <w:t>ledsPins</w:t>
+      </w:r>
+      <w:proofErr w:type="spellEnd"/>
+      <w:r>
+        <w:rPr>
+          <w:rFonts w:ascii="Consolas" w:hAnsi="Consolas"/>
+          <w:sz w:val="20"/>
+          <w:szCs w:val="20"/>
+        </w:rPr>
+        <w:t>[x],OUTPUT);             // Declara os pinos dos leds como saídas digitais</w:t>
+      </w:r>
+    </w:p>
+    <w:p>
+      <w:pPr>
+        <w:spacing w:after="0" w:line="276" w:lineRule="auto"/>
+        <w:rPr>
+          <w:rFonts w:ascii="Consolas" w:hAnsi="Consolas"/>
+          <w:sz w:val="20"/>
+          <w:szCs w:val="20"/>
+        </w:rPr>
+      </w:pPr>
+      <w:r>
+        <w:rPr>
+          <w:rFonts w:ascii="Consolas" w:hAnsi="Consolas"/>
+          <w:sz w:val="20"/>
+          <w:szCs w:val="20"/>
+        </w:rPr>
+        <w:t>   </w:t>
+      </w:r>
+      <w:proofErr w:type="spellStart"/>
       <w:proofErr w:type="gramStart"/>
       <w:r>
         <w:rPr>
@@ -4796,8 +4892,18 @@
           <w:sz w:val="20"/>
           <w:szCs w:val="20"/>
         </w:rPr>
-        <w:t>Declara</w:t>
-      </w:r>
+        <w:t>pinMode</w:t>
+      </w:r>
+      <w:proofErr w:type="spellEnd"/>
+      <w:r>
+        <w:rPr>
+          <w:rFonts w:ascii="Consolas" w:hAnsi="Consolas"/>
+          <w:sz w:val="20"/>
+          <w:szCs w:val="20"/>
+        </w:rPr>
+        <w:t>(</w:t>
+      </w:r>
+      <w:proofErr w:type="spellStart"/>
       <w:proofErr w:type="gramEnd"/>
       <w:r>
         <w:rPr>
@@ -4805,7 +4911,62 @@
           <w:sz w:val="20"/>
           <w:szCs w:val="20"/>
         </w:rPr>
-        <w:t xml:space="preserve"> todos os pinos dos </w:t>
+        <w:t>direcionalPins</w:t>
+      </w:r>
+      <w:proofErr w:type="spellEnd"/>
+      <w:r>
+        <w:rPr>
+          <w:rFonts w:ascii="Consolas" w:hAnsi="Consolas"/>
+          <w:sz w:val="20"/>
+          <w:szCs w:val="20"/>
+        </w:rPr>
+        <w:t>[x],INPUT_PULLUP); // Declara todos os pinos do direcional como entrada e ativa os resistores de "PULL UP" internos                </w:t>
+      </w:r>
+    </w:p>
+    <w:p>
+      <w:pPr>
+        <w:spacing w:after="0" w:line="276" w:lineRule="auto"/>
+        <w:rPr>
+          <w:rFonts w:ascii="Consolas" w:hAnsi="Consolas"/>
+          <w:sz w:val="20"/>
+          <w:szCs w:val="20"/>
+        </w:rPr>
+      </w:pPr>
+      <w:r>
+        <w:rPr>
+          <w:rFonts w:ascii="Consolas" w:hAnsi="Consolas"/>
+          <w:sz w:val="20"/>
+          <w:szCs w:val="20"/>
+        </w:rPr>
+        <w:t>  }</w:t>
+      </w:r>
+    </w:p>
+    <w:p>
+      <w:pPr>
+        <w:spacing w:after="0" w:line="276" w:lineRule="auto"/>
+        <w:rPr>
+          <w:rFonts w:ascii="Consolas" w:hAnsi="Consolas"/>
+          <w:sz w:val="20"/>
+          <w:szCs w:val="20"/>
+        </w:rPr>
+      </w:pPr>
+    </w:p>
+    <w:p>
+      <w:pPr>
+        <w:spacing w:after="0" w:line="276" w:lineRule="auto"/>
+        <w:rPr>
+          <w:rFonts w:ascii="Consolas" w:hAnsi="Consolas"/>
+          <w:sz w:val="20"/>
+          <w:szCs w:val="20"/>
+        </w:rPr>
+      </w:pPr>
+      <w:r>
+        <w:rPr>
+          <w:rFonts w:ascii="Consolas" w:hAnsi="Consolas"/>
+          <w:sz w:val="20"/>
+          <w:szCs w:val="20"/>
+        </w:rPr>
+        <w:t xml:space="preserve">  </w:t>
       </w:r>
       <w:proofErr w:type="spellStart"/>
       <w:r>
@@ -4814,7 +4975,7 @@
           <w:sz w:val="20"/>
           <w:szCs w:val="20"/>
         </w:rPr>
-        <w:t>botoes</w:t>
+        <w:t>Joystick.begin</w:t>
       </w:r>
       <w:proofErr w:type="spellEnd"/>
       <w:r>
@@ -4823,7 +4984,7 @@
           <w:sz w:val="20"/>
           <w:szCs w:val="20"/>
         </w:rPr>
-        <w:t xml:space="preserve"> 1 como entrada e ativa os resistores de "PULL UP" internos</w:t>
+        <w:t xml:space="preserve">(false); </w:t>
       </w:r>
     </w:p>
     <w:p>
@@ -4841,16 +5002,237 @@
           <w:sz w:val="20"/>
           <w:szCs w:val="20"/>
         </w:rPr>
+        <w:t xml:space="preserve">  </w:t>
+      </w:r>
+      <w:proofErr w:type="spellStart"/>
+      <w:r>
+        <w:rPr>
+          <w:rFonts w:ascii="Consolas" w:hAnsi="Consolas"/>
+          <w:sz w:val="20"/>
+          <w:szCs w:val="20"/>
+        </w:rPr>
+        <w:t>Joystick.setXAxisRange</w:t>
+      </w:r>
+      <w:proofErr w:type="spellEnd"/>
+      <w:r>
+        <w:rPr>
+          <w:rFonts w:ascii="Consolas" w:hAnsi="Consolas"/>
+          <w:sz w:val="20"/>
+          <w:szCs w:val="20"/>
+        </w:rPr>
+        <w:t xml:space="preserve"> (-127, 127);</w:t>
+      </w:r>
+    </w:p>
+    <w:p>
+      <w:pPr>
+        <w:spacing w:after="0" w:line="276" w:lineRule="auto"/>
+        <w:rPr>
+          <w:rFonts w:ascii="Consolas" w:hAnsi="Consolas"/>
+          <w:sz w:val="20"/>
+          <w:szCs w:val="20"/>
+        </w:rPr>
+      </w:pPr>
+      <w:r>
+        <w:rPr>
+          <w:rFonts w:ascii="Consolas" w:hAnsi="Consolas"/>
+          <w:sz w:val="20"/>
+          <w:szCs w:val="20"/>
+        </w:rPr>
+        <w:t xml:space="preserve">  </w:t>
+      </w:r>
+      <w:proofErr w:type="spellStart"/>
+      <w:r>
+        <w:rPr>
+          <w:rFonts w:ascii="Consolas" w:hAnsi="Consolas"/>
+          <w:sz w:val="20"/>
+          <w:szCs w:val="20"/>
+        </w:rPr>
+        <w:t>Joystick.setYAxisRange</w:t>
+      </w:r>
+      <w:proofErr w:type="spellEnd"/>
+      <w:r>
+        <w:rPr>
+          <w:rFonts w:ascii="Consolas" w:hAnsi="Consolas"/>
+          <w:sz w:val="20"/>
+          <w:szCs w:val="20"/>
+        </w:rPr>
+        <w:t xml:space="preserve"> (-127, 127);</w:t>
+      </w:r>
+    </w:p>
+    <w:p>
+      <w:pPr>
+        <w:spacing w:after="0" w:line="276" w:lineRule="auto"/>
+        <w:rPr>
+          <w:rFonts w:ascii="Consolas" w:hAnsi="Consolas"/>
+          <w:sz w:val="20"/>
+          <w:szCs w:val="20"/>
+        </w:rPr>
+      </w:pPr>
+      <w:r>
+        <w:rPr>
+          <w:rFonts w:ascii="Consolas" w:hAnsi="Consolas"/>
+          <w:sz w:val="20"/>
+          <w:szCs w:val="20"/>
+        </w:rPr>
+        <w:t xml:space="preserve">  </w:t>
+      </w:r>
+    </w:p>
+    <w:p>
+      <w:pPr>
+        <w:spacing w:after="0" w:line="276" w:lineRule="auto"/>
+        <w:rPr>
+          <w:rFonts w:ascii="Consolas" w:hAnsi="Consolas"/>
+          <w:sz w:val="20"/>
+          <w:szCs w:val="20"/>
+        </w:rPr>
+      </w:pPr>
+      <w:proofErr w:type="gramStart"/>
+      <w:r>
+        <w:rPr>
+          <w:rFonts w:ascii="Consolas" w:hAnsi="Consolas"/>
+          <w:sz w:val="20"/>
+          <w:szCs w:val="20"/>
+        </w:rPr>
+        <w:t>}/</w:t>
+      </w:r>
+      <w:proofErr w:type="gramEnd"/>
+      <w:r>
+        <w:rPr>
+          <w:rFonts w:ascii="Consolas" w:hAnsi="Consolas"/>
+          <w:sz w:val="20"/>
+          <w:szCs w:val="20"/>
+        </w:rPr>
+        <w:t>/ fim do setup</w:t>
+      </w:r>
+    </w:p>
+    <w:p>
+      <w:pPr>
+        <w:spacing w:after="0" w:line="276" w:lineRule="auto"/>
+        <w:rPr>
+          <w:rFonts w:ascii="Consolas" w:hAnsi="Consolas"/>
+          <w:sz w:val="20"/>
+          <w:szCs w:val="20"/>
+        </w:rPr>
+      </w:pPr>
+    </w:p>
+    <w:p>
+      <w:pPr>
+        <w:spacing w:after="0" w:line="276" w:lineRule="auto"/>
+        <w:rPr>
+          <w:rFonts w:ascii="Consolas" w:hAnsi="Consolas"/>
+          <w:sz w:val="20"/>
+          <w:szCs w:val="20"/>
+        </w:rPr>
+      </w:pPr>
+      <w:proofErr w:type="gramStart"/>
+      <w:r>
+        <w:rPr>
+          <w:rFonts w:ascii="Consolas" w:hAnsi="Consolas"/>
+          <w:sz w:val="20"/>
+          <w:szCs w:val="20"/>
+        </w:rPr>
+        <w:t>void</w:t>
+      </w:r>
+      <w:proofErr w:type="gramEnd"/>
+      <w:r>
+        <w:rPr>
+          <w:rFonts w:ascii="Consolas" w:hAnsi="Consolas"/>
+          <w:sz w:val="20"/>
+          <w:szCs w:val="20"/>
+        </w:rPr>
+        <w:t xml:space="preserve"> loop(){</w:t>
+      </w:r>
+    </w:p>
+    <w:p>
+      <w:pPr>
+        <w:spacing w:after="0" w:line="276" w:lineRule="auto"/>
+        <w:rPr>
+          <w:rFonts w:ascii="Consolas" w:hAnsi="Consolas"/>
+          <w:sz w:val="20"/>
+          <w:szCs w:val="20"/>
+        </w:rPr>
+      </w:pPr>
+      <w:r>
+        <w:rPr>
+          <w:rFonts w:ascii="Consolas" w:hAnsi="Consolas"/>
+          <w:sz w:val="20"/>
+          <w:szCs w:val="20"/>
+        </w:rPr>
+        <w:t xml:space="preserve">  </w:t>
+      </w:r>
+    </w:p>
+    <w:p>
+      <w:pPr>
+        <w:spacing w:after="0" w:line="276" w:lineRule="auto"/>
+        <w:rPr>
+          <w:rFonts w:ascii="Consolas" w:hAnsi="Consolas"/>
+          <w:sz w:val="20"/>
+          <w:szCs w:val="20"/>
+        </w:rPr>
+      </w:pPr>
+    </w:p>
+    <w:p>
+      <w:pPr>
+        <w:spacing w:after="0" w:line="276" w:lineRule="auto"/>
+        <w:rPr>
+          <w:rFonts w:ascii="Consolas" w:hAnsi="Consolas"/>
+          <w:sz w:val="20"/>
+          <w:szCs w:val="20"/>
+        </w:rPr>
+      </w:pPr>
+      <w:r>
+        <w:rPr>
+          <w:rFonts w:ascii="Consolas" w:hAnsi="Consolas"/>
+          <w:sz w:val="20"/>
+          <w:szCs w:val="20"/>
+        </w:rPr>
+        <w:t> </w:t>
+      </w:r>
+      <w:proofErr w:type="gramStart"/>
+      <w:r>
+        <w:rPr>
+          <w:rFonts w:ascii="Consolas" w:hAnsi="Consolas"/>
+          <w:sz w:val="20"/>
+          <w:szCs w:val="20"/>
+        </w:rPr>
+        <w:t>for(</w:t>
+      </w:r>
+      <w:proofErr w:type="gramEnd"/>
+      <w:r>
+        <w:rPr>
+          <w:rFonts w:ascii="Consolas" w:hAnsi="Consolas"/>
+          <w:sz w:val="20"/>
+          <w:szCs w:val="20"/>
+        </w:rPr>
+        <w:t>int x=0; x&lt;=3; x++){</w:t>
+      </w:r>
+    </w:p>
+    <w:p>
+      <w:pPr>
+        <w:spacing w:after="0" w:line="276" w:lineRule="auto"/>
+        <w:rPr>
+          <w:rFonts w:ascii="Consolas" w:hAnsi="Consolas"/>
+          <w:sz w:val="20"/>
+          <w:szCs w:val="20"/>
+        </w:rPr>
+      </w:pPr>
+      <w:r>
+        <w:rPr>
+          <w:rFonts w:ascii="Consolas" w:hAnsi="Consolas"/>
+          <w:sz w:val="20"/>
+          <w:szCs w:val="20"/>
+        </w:rPr>
         <w:t>   </w:t>
       </w:r>
       <w:proofErr w:type="spellStart"/>
-      <w:r>
-        <w:rPr>
-          <w:rFonts w:ascii="Consolas" w:hAnsi="Consolas"/>
-          <w:sz w:val="20"/>
-          <w:szCs w:val="20"/>
-        </w:rPr>
-        <w:t>pinMode</w:t>
+      <w:proofErr w:type="gramStart"/>
+      <w:r>
+        <w:rPr>
+          <w:rFonts w:ascii="Consolas" w:hAnsi="Consolas"/>
+          <w:sz w:val="20"/>
+          <w:szCs w:val="20"/>
+        </w:rPr>
+        <w:t>if</w:t>
       </w:r>
       <w:proofErr w:type="spellEnd"/>
       <w:r>
@@ -4859,8 +5241,82 @@
           <w:sz w:val="20"/>
           <w:szCs w:val="20"/>
         </w:rPr>
-        <w:t>(botoes2Pins[x</w:t>
-      </w:r>
+        <w:t>(</w:t>
+      </w:r>
+      <w:proofErr w:type="spellStart"/>
+      <w:proofErr w:type="gramEnd"/>
+      <w:r>
+        <w:rPr>
+          <w:rFonts w:ascii="Consolas" w:hAnsi="Consolas"/>
+          <w:sz w:val="20"/>
+          <w:szCs w:val="20"/>
+        </w:rPr>
+        <w:t>digitalRead</w:t>
+      </w:r>
+      <w:proofErr w:type="spellEnd"/>
+      <w:r>
+        <w:rPr>
+          <w:rFonts w:ascii="Consolas" w:hAnsi="Consolas"/>
+          <w:sz w:val="20"/>
+          <w:szCs w:val="20"/>
+        </w:rPr>
+        <w:t>(botoes1Pins[x])==LOW){ // Lê e "seta" valores dos botões 1</w:t>
+      </w:r>
+    </w:p>
+    <w:p>
+      <w:pPr>
+        <w:spacing w:after="0" w:line="276" w:lineRule="auto"/>
+        <w:rPr>
+          <w:rFonts w:ascii="Consolas" w:hAnsi="Consolas"/>
+          <w:sz w:val="20"/>
+          <w:szCs w:val="20"/>
+        </w:rPr>
+      </w:pPr>
+      <w:r>
+        <w:rPr>
+          <w:rFonts w:ascii="Consolas" w:hAnsi="Consolas"/>
+          <w:sz w:val="20"/>
+          <w:szCs w:val="20"/>
+        </w:rPr>
+        <w:t>     </w:t>
+      </w:r>
+      <w:proofErr w:type="spellStart"/>
+      <w:r>
+        <w:rPr>
+          <w:rFonts w:ascii="Consolas" w:hAnsi="Consolas"/>
+          <w:sz w:val="20"/>
+          <w:szCs w:val="20"/>
+        </w:rPr>
+        <w:t>Joystick.setButton</w:t>
+      </w:r>
+      <w:proofErr w:type="spellEnd"/>
+      <w:r>
+        <w:rPr>
+          <w:rFonts w:ascii="Consolas" w:hAnsi="Consolas"/>
+          <w:sz w:val="20"/>
+          <w:szCs w:val="20"/>
+        </w:rPr>
+        <w:t>(x, 1);  </w:t>
+      </w:r>
+    </w:p>
+    <w:p>
+      <w:pPr>
+        <w:spacing w:after="0" w:line="276" w:lineRule="auto"/>
+        <w:rPr>
+          <w:rFonts w:ascii="Consolas" w:hAnsi="Consolas"/>
+          <w:sz w:val="20"/>
+          <w:szCs w:val="20"/>
+        </w:rPr>
+      </w:pPr>
+      <w:r>
+        <w:rPr>
+          <w:rFonts w:ascii="Consolas" w:hAnsi="Consolas"/>
+          <w:sz w:val="20"/>
+          <w:szCs w:val="20"/>
+        </w:rPr>
+        <w:t>     </w:t>
+      </w:r>
+      <w:proofErr w:type="spellStart"/>
       <w:proofErr w:type="gramStart"/>
       <w:r>
         <w:rPr>
@@ -4868,8 +5324,18 @@
           <w:sz w:val="20"/>
           <w:szCs w:val="20"/>
         </w:rPr>
-        <w:t>],INPUT</w:t>
-      </w:r>
+        <w:t>digitalWrite</w:t>
+      </w:r>
+      <w:proofErr w:type="spellEnd"/>
+      <w:r>
+        <w:rPr>
+          <w:rFonts w:ascii="Consolas" w:hAnsi="Consolas"/>
+          <w:sz w:val="20"/>
+          <w:szCs w:val="20"/>
+        </w:rPr>
+        <w:t>(</w:t>
+      </w:r>
+      <w:proofErr w:type="spellStart"/>
       <w:proofErr w:type="gramEnd"/>
       <w:r>
         <w:rPr>
@@ -4877,52 +5343,7 @@
           <w:sz w:val="20"/>
           <w:szCs w:val="20"/>
         </w:rPr>
-        <w:t>_PULLUP</w:t>
-      </w:r>
-      <w:proofErr w:type="gramStart"/>
-      <w:r>
-        <w:rPr>
-          <w:rFonts w:ascii="Consolas" w:hAnsi="Consolas"/>
-          <w:sz w:val="20"/>
-          <w:szCs w:val="20"/>
-        </w:rPr>
-        <w:t xml:space="preserve">);   </w:t>
-      </w:r>
-      <w:proofErr w:type="gramEnd"/>
-      <w:r>
-        <w:rPr>
-          <w:rFonts w:ascii="Consolas" w:hAnsi="Consolas"/>
-          <w:sz w:val="20"/>
-          <w:szCs w:val="20"/>
-        </w:rPr>
-        <w:t xml:space="preserve"> // </w:t>
-      </w:r>
-      <w:proofErr w:type="gramStart"/>
-      <w:r>
-        <w:rPr>
-          <w:rFonts w:ascii="Consolas" w:hAnsi="Consolas"/>
-          <w:sz w:val="20"/>
-          <w:szCs w:val="20"/>
-        </w:rPr>
-        <w:t>Declara</w:t>
-      </w:r>
-      <w:proofErr w:type="gramEnd"/>
-      <w:r>
-        <w:rPr>
-          <w:rFonts w:ascii="Consolas" w:hAnsi="Consolas"/>
-          <w:sz w:val="20"/>
-          <w:szCs w:val="20"/>
-        </w:rPr>
-        <w:t xml:space="preserve"> todos os pinos dos </w:t>
-      </w:r>
-      <w:proofErr w:type="spellStart"/>
-      <w:r>
-        <w:rPr>
-          <w:rFonts w:ascii="Consolas" w:hAnsi="Consolas"/>
-          <w:sz w:val="20"/>
-          <w:szCs w:val="20"/>
-        </w:rPr>
-        <w:t>botoes</w:t>
+        <w:t>ledsPins</w:t>
       </w:r>
       <w:proofErr w:type="spellEnd"/>
       <w:r>
@@ -4931,697 +5352,7 @@
           <w:sz w:val="20"/>
           <w:szCs w:val="20"/>
         </w:rPr>
-        <w:t xml:space="preserve"> 2 como entrada e ativa os resistores de "PULL UP" internos</w:t>
-      </w:r>
-    </w:p>
-    <w:p>
-      <w:pPr>
-        <w:spacing w:after="0" w:line="276" w:lineRule="auto"/>
-        <w:rPr>
-          <w:rFonts w:ascii="Consolas" w:hAnsi="Consolas"/>
-          <w:sz w:val="20"/>
-          <w:szCs w:val="20"/>
-        </w:rPr>
-      </w:pPr>
-      <w:r>
-        <w:rPr>
-          <w:rFonts w:ascii="Consolas" w:hAnsi="Consolas"/>
-          <w:sz w:val="20"/>
-          <w:szCs w:val="20"/>
-        </w:rPr>
-        <w:t>   </w:t>
-      </w:r>
-      <w:proofErr w:type="spellStart"/>
-      <w:r>
-        <w:rPr>
-          <w:rFonts w:ascii="Consolas" w:hAnsi="Consolas"/>
-          <w:sz w:val="20"/>
-          <w:szCs w:val="20"/>
-        </w:rPr>
-        <w:t>pinMode</w:t>
-      </w:r>
-      <w:proofErr w:type="spellEnd"/>
-      <w:r>
-        <w:rPr>
-          <w:rFonts w:ascii="Consolas" w:hAnsi="Consolas"/>
-          <w:sz w:val="20"/>
-          <w:szCs w:val="20"/>
-        </w:rPr>
-        <w:t>(</w:t>
-      </w:r>
-      <w:proofErr w:type="spellStart"/>
-      <w:r>
-        <w:rPr>
-          <w:rFonts w:ascii="Consolas" w:hAnsi="Consolas"/>
-          <w:sz w:val="20"/>
-          <w:szCs w:val="20"/>
-        </w:rPr>
-        <w:t>ledsPins</w:t>
-      </w:r>
-      <w:proofErr w:type="spellEnd"/>
-      <w:r>
-        <w:rPr>
-          <w:rFonts w:ascii="Consolas" w:hAnsi="Consolas"/>
-          <w:sz w:val="20"/>
-          <w:szCs w:val="20"/>
-        </w:rPr>
-        <w:t>[x</w:t>
-      </w:r>
-      <w:proofErr w:type="gramStart"/>
-      <w:r>
-        <w:rPr>
-          <w:rFonts w:ascii="Consolas" w:hAnsi="Consolas"/>
-          <w:sz w:val="20"/>
-          <w:szCs w:val="20"/>
-        </w:rPr>
-        <w:t xml:space="preserve">],OUTPUT);   </w:t>
-      </w:r>
-      <w:proofErr w:type="gramEnd"/>
-      <w:r>
-        <w:rPr>
-          <w:rFonts w:ascii="Consolas" w:hAnsi="Consolas"/>
-          <w:sz w:val="20"/>
-          <w:szCs w:val="20"/>
-        </w:rPr>
-        <w:t xml:space="preserve">          // </w:t>
-      </w:r>
-      <w:proofErr w:type="gramStart"/>
-      <w:r>
-        <w:rPr>
-          <w:rFonts w:ascii="Consolas" w:hAnsi="Consolas"/>
-          <w:sz w:val="20"/>
-          <w:szCs w:val="20"/>
-        </w:rPr>
-        <w:t>Declara</w:t>
-      </w:r>
-      <w:proofErr w:type="gramEnd"/>
-      <w:r>
-        <w:rPr>
-          <w:rFonts w:ascii="Consolas" w:hAnsi="Consolas"/>
-          <w:sz w:val="20"/>
-          <w:szCs w:val="20"/>
-        </w:rPr>
-        <w:t xml:space="preserve"> os pinos dos leds como saídas digitais</w:t>
-      </w:r>
-    </w:p>
-    <w:p>
-      <w:pPr>
-        <w:spacing w:after="0" w:line="276" w:lineRule="auto"/>
-        <w:rPr>
-          <w:rFonts w:ascii="Consolas" w:hAnsi="Consolas"/>
-          <w:sz w:val="20"/>
-          <w:szCs w:val="20"/>
-        </w:rPr>
-      </w:pPr>
-      <w:r>
-        <w:rPr>
-          <w:rFonts w:ascii="Consolas" w:hAnsi="Consolas"/>
-          <w:sz w:val="20"/>
-          <w:szCs w:val="20"/>
-        </w:rPr>
-        <w:t>   </w:t>
-      </w:r>
-      <w:proofErr w:type="spellStart"/>
-      <w:r>
-        <w:rPr>
-          <w:rFonts w:ascii="Consolas" w:hAnsi="Consolas"/>
-          <w:sz w:val="20"/>
-          <w:szCs w:val="20"/>
-        </w:rPr>
-        <w:t>pinMode</w:t>
-      </w:r>
-      <w:proofErr w:type="spellEnd"/>
-      <w:r>
-        <w:rPr>
-          <w:rFonts w:ascii="Consolas" w:hAnsi="Consolas"/>
-          <w:sz w:val="20"/>
-          <w:szCs w:val="20"/>
-        </w:rPr>
-        <w:t>(</w:t>
-      </w:r>
-      <w:proofErr w:type="spellStart"/>
-      <w:r>
-        <w:rPr>
-          <w:rFonts w:ascii="Consolas" w:hAnsi="Consolas"/>
-          <w:sz w:val="20"/>
-          <w:szCs w:val="20"/>
-        </w:rPr>
-        <w:t>direcionalPins</w:t>
-      </w:r>
-      <w:proofErr w:type="spellEnd"/>
-      <w:r>
-        <w:rPr>
-          <w:rFonts w:ascii="Consolas" w:hAnsi="Consolas"/>
-          <w:sz w:val="20"/>
-          <w:szCs w:val="20"/>
-        </w:rPr>
-        <w:t>[x</w:t>
-      </w:r>
-      <w:proofErr w:type="gramStart"/>
-      <w:r>
-        <w:rPr>
-          <w:rFonts w:ascii="Consolas" w:hAnsi="Consolas"/>
-          <w:sz w:val="20"/>
-          <w:szCs w:val="20"/>
-        </w:rPr>
-        <w:t>],INPUT</w:t>
-      </w:r>
-      <w:proofErr w:type="gramEnd"/>
-      <w:r>
-        <w:rPr>
-          <w:rFonts w:ascii="Consolas" w:hAnsi="Consolas"/>
-          <w:sz w:val="20"/>
-          <w:szCs w:val="20"/>
-        </w:rPr>
-        <w:t xml:space="preserve">_PULLUP); // </w:t>
-      </w:r>
-      <w:proofErr w:type="gramStart"/>
-      <w:r>
-        <w:rPr>
-          <w:rFonts w:ascii="Consolas" w:hAnsi="Consolas"/>
-          <w:sz w:val="20"/>
-          <w:szCs w:val="20"/>
-        </w:rPr>
-        <w:t>Declara</w:t>
-      </w:r>
-      <w:proofErr w:type="gramEnd"/>
-      <w:r>
-        <w:rPr>
-          <w:rFonts w:ascii="Consolas" w:hAnsi="Consolas"/>
-          <w:sz w:val="20"/>
-          <w:szCs w:val="20"/>
-        </w:rPr>
-        <w:t xml:space="preserve"> todos os pinos do direcional como entrada e ativa os resistores de "PULL UP" internos                </w:t>
-      </w:r>
-    </w:p>
-    <w:p>
-      <w:pPr>
-        <w:spacing w:after="0" w:line="276" w:lineRule="auto"/>
-        <w:rPr>
-          <w:rFonts w:ascii="Consolas" w:hAnsi="Consolas"/>
-          <w:sz w:val="20"/>
-          <w:szCs w:val="20"/>
-        </w:rPr>
-      </w:pPr>
-      <w:r>
-        <w:rPr>
-          <w:rFonts w:ascii="Consolas" w:hAnsi="Consolas"/>
-          <w:sz w:val="20"/>
-          <w:szCs w:val="20"/>
-        </w:rPr>
-        <w:t>  }</w:t>
-      </w:r>
-    </w:p>
-    <w:p>
-      <w:pPr>
-        <w:spacing w:after="0" w:line="276" w:lineRule="auto"/>
-        <w:rPr>
-          <w:rFonts w:ascii="Consolas" w:hAnsi="Consolas"/>
-          <w:sz w:val="20"/>
-          <w:szCs w:val="20"/>
-        </w:rPr>
-      </w:pPr>
-    </w:p>
-    <w:p>
-      <w:pPr>
-        <w:spacing w:after="0" w:line="276" w:lineRule="auto"/>
-        <w:rPr>
-          <w:rFonts w:ascii="Consolas" w:hAnsi="Consolas"/>
-          <w:sz w:val="20"/>
-          <w:szCs w:val="20"/>
-        </w:rPr>
-      </w:pPr>
-      <w:r>
-        <w:rPr>
-          <w:rFonts w:ascii="Consolas" w:hAnsi="Consolas"/>
-          <w:sz w:val="20"/>
-          <w:szCs w:val="20"/>
-        </w:rPr>
-        <w:t xml:space="preserve">  </w:t>
-      </w:r>
-      <w:proofErr w:type="spellStart"/>
-      <w:r>
-        <w:rPr>
-          <w:rFonts w:ascii="Consolas" w:hAnsi="Consolas"/>
-          <w:sz w:val="20"/>
-          <w:szCs w:val="20"/>
-        </w:rPr>
-        <w:t>Joystick.begin</w:t>
-      </w:r>
-      <w:proofErr w:type="spellEnd"/>
-      <w:r>
-        <w:rPr>
-          <w:rFonts w:ascii="Consolas" w:hAnsi="Consolas"/>
-          <w:sz w:val="20"/>
-          <w:szCs w:val="20"/>
-        </w:rPr>
-        <w:t xml:space="preserve">(false); </w:t>
-      </w:r>
-    </w:p>
-    <w:p>
-      <w:pPr>
-        <w:spacing w:after="0" w:line="276" w:lineRule="auto"/>
-        <w:rPr>
-          <w:rFonts w:ascii="Consolas" w:hAnsi="Consolas"/>
-          <w:sz w:val="20"/>
-          <w:szCs w:val="20"/>
-        </w:rPr>
-      </w:pPr>
-      <w:r>
-        <w:rPr>
-          <w:rFonts w:ascii="Consolas" w:hAnsi="Consolas"/>
-          <w:sz w:val="20"/>
-          <w:szCs w:val="20"/>
-        </w:rPr>
-        <w:t xml:space="preserve">  </w:t>
-      </w:r>
-      <w:proofErr w:type="spellStart"/>
-      <w:r>
-        <w:rPr>
-          <w:rFonts w:ascii="Consolas" w:hAnsi="Consolas"/>
-          <w:sz w:val="20"/>
-          <w:szCs w:val="20"/>
-        </w:rPr>
-        <w:t>Joystick.setXAxisRange</w:t>
-      </w:r>
-      <w:proofErr w:type="spellEnd"/>
-      <w:r>
-        <w:rPr>
-          <w:rFonts w:ascii="Consolas" w:hAnsi="Consolas"/>
-          <w:sz w:val="20"/>
-          <w:szCs w:val="20"/>
-        </w:rPr>
-        <w:t xml:space="preserve"> (-127, 127);</w:t>
-      </w:r>
-    </w:p>
-    <w:p>
-      <w:pPr>
-        <w:spacing w:after="0" w:line="276" w:lineRule="auto"/>
-        <w:rPr>
-          <w:rFonts w:ascii="Consolas" w:hAnsi="Consolas"/>
-          <w:sz w:val="20"/>
-          <w:szCs w:val="20"/>
-        </w:rPr>
-      </w:pPr>
-      <w:r>
-        <w:rPr>
-          <w:rFonts w:ascii="Consolas" w:hAnsi="Consolas"/>
-          <w:sz w:val="20"/>
-          <w:szCs w:val="20"/>
-        </w:rPr>
-        <w:t xml:space="preserve">  </w:t>
-      </w:r>
-      <w:proofErr w:type="spellStart"/>
-      <w:r>
-        <w:rPr>
-          <w:rFonts w:ascii="Consolas" w:hAnsi="Consolas"/>
-          <w:sz w:val="20"/>
-          <w:szCs w:val="20"/>
-        </w:rPr>
-        <w:t>Joystick.setYAxisRange</w:t>
-      </w:r>
-      <w:proofErr w:type="spellEnd"/>
-      <w:r>
-        <w:rPr>
-          <w:rFonts w:ascii="Consolas" w:hAnsi="Consolas"/>
-          <w:sz w:val="20"/>
-          <w:szCs w:val="20"/>
-        </w:rPr>
-        <w:t xml:space="preserve"> (-127, 127);</w:t>
-      </w:r>
-    </w:p>
-    <w:p>
-      <w:pPr>
-        <w:spacing w:after="0" w:line="276" w:lineRule="auto"/>
-        <w:rPr>
-          <w:rFonts w:ascii="Consolas" w:hAnsi="Consolas"/>
-          <w:sz w:val="20"/>
-          <w:szCs w:val="20"/>
-        </w:rPr>
-      </w:pPr>
-      <w:r>
-        <w:rPr>
-          <w:rFonts w:ascii="Consolas" w:hAnsi="Consolas"/>
-          <w:sz w:val="20"/>
-          <w:szCs w:val="20"/>
-        </w:rPr>
-        <w:t xml:space="preserve">  </w:t>
-      </w:r>
-    </w:p>
-    <w:p>
-      <w:pPr>
-        <w:spacing w:after="0" w:line="276" w:lineRule="auto"/>
-        <w:rPr>
-          <w:rFonts w:ascii="Consolas" w:hAnsi="Consolas"/>
-          <w:sz w:val="20"/>
-          <w:szCs w:val="20"/>
-        </w:rPr>
-      </w:pPr>
-      <w:proofErr w:type="gramStart"/>
-      <w:r>
-        <w:rPr>
-          <w:rFonts w:ascii="Consolas" w:hAnsi="Consolas"/>
-          <w:sz w:val="20"/>
-          <w:szCs w:val="20"/>
-        </w:rPr>
-        <w:t>}/</w:t>
-      </w:r>
-      <w:proofErr w:type="gramEnd"/>
-      <w:r>
-        <w:rPr>
-          <w:rFonts w:ascii="Consolas" w:hAnsi="Consolas"/>
-          <w:sz w:val="20"/>
-          <w:szCs w:val="20"/>
-        </w:rPr>
-        <w:t>/ fim do setup</w:t>
-      </w:r>
-    </w:p>
-    <w:p>
-      <w:pPr>
-        <w:spacing w:after="0" w:line="276" w:lineRule="auto"/>
-        <w:rPr>
-          <w:rFonts w:ascii="Consolas" w:hAnsi="Consolas"/>
-          <w:sz w:val="20"/>
-          <w:szCs w:val="20"/>
-        </w:rPr>
-      </w:pPr>
-    </w:p>
-    <w:p>
-      <w:pPr>
-        <w:spacing w:after="0" w:line="276" w:lineRule="auto"/>
-        <w:rPr>
-          <w:rFonts w:ascii="Consolas" w:hAnsi="Consolas"/>
-          <w:sz w:val="20"/>
-          <w:szCs w:val="20"/>
-        </w:rPr>
-      </w:pPr>
-      <w:r>
-        <w:rPr>
-          <w:rFonts w:ascii="Consolas" w:hAnsi="Consolas"/>
-          <w:sz w:val="20"/>
-          <w:szCs w:val="20"/>
-        </w:rPr>
-        <w:t xml:space="preserve">void </w:t>
-      </w:r>
-      <w:proofErr w:type="gramStart"/>
-      <w:r>
-        <w:rPr>
-          <w:rFonts w:ascii="Consolas" w:hAnsi="Consolas"/>
-          <w:sz w:val="20"/>
-          <w:szCs w:val="20"/>
-        </w:rPr>
-        <w:t>loop(){</w:t>
-      </w:r>
-      <w:proofErr w:type="gramEnd"/>
-    </w:p>
-    <w:p>
-      <w:pPr>
-        <w:spacing w:after="0" w:line="276" w:lineRule="auto"/>
-        <w:rPr>
-          <w:rFonts w:ascii="Consolas" w:hAnsi="Consolas"/>
-          <w:sz w:val="20"/>
-          <w:szCs w:val="20"/>
-        </w:rPr>
-      </w:pPr>
-      <w:r>
-        <w:rPr>
-          <w:rFonts w:ascii="Consolas" w:hAnsi="Consolas"/>
-          <w:sz w:val="20"/>
-          <w:szCs w:val="20"/>
-        </w:rPr>
-        <w:t xml:space="preserve">  </w:t>
-      </w:r>
-    </w:p>
-    <w:p>
-      <w:pPr>
-        <w:spacing w:after="0" w:line="276" w:lineRule="auto"/>
-        <w:rPr>
-          <w:rFonts w:ascii="Consolas" w:hAnsi="Consolas"/>
-          <w:sz w:val="20"/>
-          <w:szCs w:val="20"/>
-        </w:rPr>
-      </w:pPr>
-    </w:p>
-    <w:p>
-      <w:pPr>
-        <w:spacing w:after="0" w:line="276" w:lineRule="auto"/>
-        <w:rPr>
-          <w:rFonts w:ascii="Consolas" w:hAnsi="Consolas"/>
-          <w:sz w:val="20"/>
-          <w:szCs w:val="20"/>
-        </w:rPr>
-      </w:pPr>
-      <w:r>
-        <w:rPr>
-          <w:rFonts w:ascii="Consolas" w:hAnsi="Consolas"/>
-          <w:sz w:val="20"/>
-          <w:szCs w:val="20"/>
-        </w:rPr>
-        <w:t> </w:t>
-      </w:r>
-      <w:proofErr w:type="gramStart"/>
-      <w:r>
-        <w:rPr>
-          <w:rFonts w:ascii="Consolas" w:hAnsi="Consolas"/>
-          <w:sz w:val="20"/>
-          <w:szCs w:val="20"/>
-        </w:rPr>
-        <w:t>for(</w:t>
-      </w:r>
-      <w:proofErr w:type="gramEnd"/>
-      <w:r>
-        <w:rPr>
-          <w:rFonts w:ascii="Consolas" w:hAnsi="Consolas"/>
-          <w:sz w:val="20"/>
-          <w:szCs w:val="20"/>
-        </w:rPr>
-        <w:t>int x=0; x&lt;=3; x+</w:t>
-      </w:r>
-      <w:proofErr w:type="gramStart"/>
-      <w:r>
-        <w:rPr>
-          <w:rFonts w:ascii="Consolas" w:hAnsi="Consolas"/>
-          <w:sz w:val="20"/>
-          <w:szCs w:val="20"/>
-        </w:rPr>
-        <w:t>+){</w:t>
-      </w:r>
-      <w:proofErr w:type="gramEnd"/>
-    </w:p>
-    <w:p>
-      <w:pPr>
-        <w:spacing w:after="0" w:line="276" w:lineRule="auto"/>
-        <w:rPr>
-          <w:rFonts w:ascii="Consolas" w:hAnsi="Consolas"/>
-          <w:sz w:val="20"/>
-          <w:szCs w:val="20"/>
-        </w:rPr>
-      </w:pPr>
-      <w:r>
-        <w:rPr>
-          <w:rFonts w:ascii="Consolas" w:hAnsi="Consolas"/>
-          <w:sz w:val="20"/>
-          <w:szCs w:val="20"/>
-        </w:rPr>
-        <w:t>   </w:t>
-      </w:r>
-      <w:proofErr w:type="spellStart"/>
-      <w:r>
-        <w:rPr>
-          <w:rFonts w:ascii="Consolas" w:hAnsi="Consolas"/>
-          <w:sz w:val="20"/>
-          <w:szCs w:val="20"/>
-        </w:rPr>
-        <w:t>if</w:t>
-      </w:r>
-      <w:proofErr w:type="spellEnd"/>
-      <w:r>
-        <w:rPr>
-          <w:rFonts w:ascii="Consolas" w:hAnsi="Consolas"/>
-          <w:sz w:val="20"/>
-          <w:szCs w:val="20"/>
-        </w:rPr>
-        <w:t>(</w:t>
-      </w:r>
-      <w:proofErr w:type="spellStart"/>
-      <w:r>
-        <w:rPr>
-          <w:rFonts w:ascii="Consolas" w:hAnsi="Consolas"/>
-          <w:sz w:val="20"/>
-          <w:szCs w:val="20"/>
-        </w:rPr>
-        <w:t>digitalRead</w:t>
-      </w:r>
-      <w:proofErr w:type="spellEnd"/>
-      <w:r>
-        <w:rPr>
-          <w:rFonts w:ascii="Consolas" w:hAnsi="Consolas"/>
-          <w:sz w:val="20"/>
-          <w:szCs w:val="20"/>
-        </w:rPr>
-        <w:t>(botoes1Pins[x</w:t>
-      </w:r>
-      <w:proofErr w:type="gramStart"/>
-      <w:r>
-        <w:rPr>
-          <w:rFonts w:ascii="Consolas" w:hAnsi="Consolas"/>
-          <w:sz w:val="20"/>
-          <w:szCs w:val="20"/>
-        </w:rPr>
-        <w:t>])=</w:t>
-      </w:r>
-      <w:proofErr w:type="gramEnd"/>
-      <w:r>
-        <w:rPr>
-          <w:rFonts w:ascii="Consolas" w:hAnsi="Consolas"/>
-          <w:sz w:val="20"/>
-          <w:szCs w:val="20"/>
-        </w:rPr>
-        <w:t>=</w:t>
-      </w:r>
-      <w:proofErr w:type="gramStart"/>
-      <w:r>
-        <w:rPr>
-          <w:rFonts w:ascii="Consolas" w:hAnsi="Consolas"/>
-          <w:sz w:val="20"/>
-          <w:szCs w:val="20"/>
-        </w:rPr>
-        <w:t>LOW){</w:t>
-      </w:r>
-      <w:proofErr w:type="gramEnd"/>
-      <w:r>
-        <w:rPr>
-          <w:rFonts w:ascii="Consolas" w:hAnsi="Consolas"/>
-          <w:sz w:val="20"/>
-          <w:szCs w:val="20"/>
-        </w:rPr>
-        <w:t xml:space="preserve"> // Lê e "seta" valores dos botões 1</w:t>
-      </w:r>
-    </w:p>
-    <w:p>
-      <w:pPr>
-        <w:spacing w:after="0" w:line="276" w:lineRule="auto"/>
-        <w:rPr>
-          <w:rFonts w:ascii="Consolas" w:hAnsi="Consolas"/>
-          <w:sz w:val="20"/>
-          <w:szCs w:val="20"/>
-        </w:rPr>
-      </w:pPr>
-      <w:r>
-        <w:rPr>
-          <w:rFonts w:ascii="Consolas" w:hAnsi="Consolas"/>
-          <w:sz w:val="20"/>
-          <w:szCs w:val="20"/>
-        </w:rPr>
-        <w:t>     </w:t>
-      </w:r>
-      <w:proofErr w:type="spellStart"/>
-      <w:r>
-        <w:rPr>
-          <w:rFonts w:ascii="Consolas" w:hAnsi="Consolas"/>
-          <w:sz w:val="20"/>
-          <w:szCs w:val="20"/>
-        </w:rPr>
-        <w:t>Joystick.setButton</w:t>
-      </w:r>
-      <w:proofErr w:type="spellEnd"/>
-      <w:r>
-        <w:rPr>
-          <w:rFonts w:ascii="Consolas" w:hAnsi="Consolas"/>
-          <w:sz w:val="20"/>
-          <w:szCs w:val="20"/>
-        </w:rPr>
-        <w:t>(x, 1);  </w:t>
-      </w:r>
-    </w:p>
-    <w:p>
-      <w:pPr>
-        <w:spacing w:after="0" w:line="276" w:lineRule="auto"/>
-        <w:rPr>
-          <w:rFonts w:ascii="Consolas" w:hAnsi="Consolas"/>
-          <w:sz w:val="20"/>
-          <w:szCs w:val="20"/>
-        </w:rPr>
-      </w:pPr>
-      <w:r>
-        <w:rPr>
-          <w:rFonts w:ascii="Consolas" w:hAnsi="Consolas"/>
-          <w:sz w:val="20"/>
-          <w:szCs w:val="20"/>
-        </w:rPr>
-        <w:t>     </w:t>
-      </w:r>
-      <w:proofErr w:type="spellStart"/>
-      <w:r>
-        <w:rPr>
-          <w:rFonts w:ascii="Consolas" w:hAnsi="Consolas"/>
-          <w:sz w:val="20"/>
-          <w:szCs w:val="20"/>
-        </w:rPr>
-        <w:t>digitalWrite</w:t>
-      </w:r>
-      <w:proofErr w:type="spellEnd"/>
-      <w:r>
-        <w:rPr>
-          <w:rFonts w:ascii="Consolas" w:hAnsi="Consolas"/>
-          <w:sz w:val="20"/>
-          <w:szCs w:val="20"/>
-        </w:rPr>
-        <w:t>(</w:t>
-      </w:r>
-      <w:proofErr w:type="spellStart"/>
-      <w:r>
-        <w:rPr>
-          <w:rFonts w:ascii="Consolas" w:hAnsi="Consolas"/>
-          <w:sz w:val="20"/>
-          <w:szCs w:val="20"/>
-        </w:rPr>
-        <w:t>ledsPins</w:t>
-      </w:r>
-      <w:proofErr w:type="spellEnd"/>
-      <w:r>
-        <w:rPr>
-          <w:rFonts w:ascii="Consolas" w:hAnsi="Consolas"/>
-          <w:sz w:val="20"/>
-          <w:szCs w:val="20"/>
-        </w:rPr>
-        <w:t>[x</w:t>
-      </w:r>
-      <w:proofErr w:type="gramStart"/>
-      <w:r>
-        <w:rPr>
-          <w:rFonts w:ascii="Consolas" w:hAnsi="Consolas"/>
-          <w:sz w:val="20"/>
-          <w:szCs w:val="20"/>
-        </w:rPr>
-        <w:t>],LOW</w:t>
-      </w:r>
-      <w:proofErr w:type="gramEnd"/>
-      <w:r>
-        <w:rPr>
-          <w:rFonts w:ascii="Consolas" w:hAnsi="Consolas"/>
-          <w:sz w:val="20"/>
-          <w:szCs w:val="20"/>
-        </w:rPr>
-        <w:t xml:space="preserve">); // </w:t>
-      </w:r>
-      <w:proofErr w:type="gramStart"/>
-      <w:r>
-        <w:rPr>
-          <w:rFonts w:ascii="Consolas" w:hAnsi="Consolas"/>
-          <w:sz w:val="20"/>
-          <w:szCs w:val="20"/>
-        </w:rPr>
-        <w:t>Desliga</w:t>
-      </w:r>
-      <w:proofErr w:type="gramEnd"/>
-      <w:r>
-        <w:rPr>
-          <w:rFonts w:ascii="Consolas" w:hAnsi="Consolas"/>
-          <w:sz w:val="20"/>
-          <w:szCs w:val="20"/>
-        </w:rPr>
-        <w:t xml:space="preserve"> o led correspondente ao botão "pressionado"</w:t>
+        <w:t>[x],LOW); // Desliga o led correspondente ao botão "pressionado"</w:t>
       </w:r>
     </w:p>
     <w:p>
@@ -5735,6 +5466,7 @@
         <w:t>     </w:t>
       </w:r>
       <w:proofErr w:type="spellStart"/>
+      <w:proofErr w:type="gramStart"/>
       <w:r>
         <w:rPr>
           <w:rFonts w:ascii="Consolas" w:hAnsi="Consolas"/>
@@ -5753,6 +5485,7 @@
         <w:t>(</w:t>
       </w:r>
       <w:proofErr w:type="spellStart"/>
+      <w:proofErr w:type="gramEnd"/>
       <w:r>
         <w:rPr>
           <w:rFonts w:ascii="Consolas" w:hAnsi="Consolas"/>
@@ -5768,43 +5501,7 @@
           <w:sz w:val="20"/>
           <w:szCs w:val="20"/>
         </w:rPr>
-        <w:t>[x</w:t>
-      </w:r>
-      <w:proofErr w:type="gramStart"/>
-      <w:r>
-        <w:rPr>
-          <w:rFonts w:ascii="Consolas" w:hAnsi="Consolas"/>
-          <w:sz w:val="20"/>
-          <w:szCs w:val="20"/>
-        </w:rPr>
-        <w:t>],HIGH);  /</w:t>
-      </w:r>
-      <w:proofErr w:type="gramEnd"/>
-      <w:r>
-        <w:rPr>
-          <w:rFonts w:ascii="Consolas" w:hAnsi="Consolas"/>
-          <w:sz w:val="20"/>
-          <w:szCs w:val="20"/>
-        </w:rPr>
-        <w:t xml:space="preserve">/ </w:t>
-      </w:r>
-      <w:proofErr w:type="gramStart"/>
-      <w:r>
-        <w:rPr>
-          <w:rFonts w:ascii="Consolas" w:hAnsi="Consolas"/>
-          <w:sz w:val="20"/>
-          <w:szCs w:val="20"/>
-        </w:rPr>
-        <w:t>Liga</w:t>
-      </w:r>
-      <w:proofErr w:type="gramEnd"/>
-      <w:r>
-        <w:rPr>
-          <w:rFonts w:ascii="Consolas" w:hAnsi="Consolas"/>
-          <w:sz w:val="20"/>
-          <w:szCs w:val="20"/>
-        </w:rPr>
-        <w:t xml:space="preserve"> o led correspondente ao botão "solto"</w:t>
+        <w:t>[x],HIGH);  // Liga o led correspondente ao botão "solto"</w:t>
       </w:r>
     </w:p>
     <w:p>
@@ -5869,168 +5566,6 @@
           <w:szCs w:val="20"/>
         </w:rPr>
         <w:t xml:space="preserve">    </w:t>
-      </w:r>
-      <w:proofErr w:type="spellStart"/>
-      <w:r>
-        <w:rPr>
-          <w:rFonts w:ascii="Consolas" w:hAnsi="Consolas"/>
-          <w:sz w:val="20"/>
-          <w:szCs w:val="20"/>
-        </w:rPr>
-        <w:t>if</w:t>
-      </w:r>
-      <w:proofErr w:type="spellEnd"/>
-      <w:r>
-        <w:rPr>
-          <w:rFonts w:ascii="Consolas" w:hAnsi="Consolas"/>
-          <w:sz w:val="20"/>
-          <w:szCs w:val="20"/>
-        </w:rPr>
-        <w:t>(</w:t>
-      </w:r>
-      <w:proofErr w:type="spellStart"/>
-      <w:r>
-        <w:rPr>
-          <w:rFonts w:ascii="Consolas" w:hAnsi="Consolas"/>
-          <w:sz w:val="20"/>
-          <w:szCs w:val="20"/>
-        </w:rPr>
-        <w:t>digitalRead</w:t>
-      </w:r>
-      <w:proofErr w:type="spellEnd"/>
-      <w:r>
-        <w:rPr>
-          <w:rFonts w:ascii="Consolas" w:hAnsi="Consolas"/>
-          <w:sz w:val="20"/>
-          <w:szCs w:val="20"/>
-        </w:rPr>
-        <w:t>(botoes2Pins[x</w:t>
-      </w:r>
-      <w:proofErr w:type="gramStart"/>
-      <w:r>
-        <w:rPr>
-          <w:rFonts w:ascii="Consolas" w:hAnsi="Consolas"/>
-          <w:sz w:val="20"/>
-          <w:szCs w:val="20"/>
-        </w:rPr>
-        <w:t>])=</w:t>
-      </w:r>
-      <w:proofErr w:type="gramEnd"/>
-      <w:r>
-        <w:rPr>
-          <w:rFonts w:ascii="Consolas" w:hAnsi="Consolas"/>
-          <w:sz w:val="20"/>
-          <w:szCs w:val="20"/>
-        </w:rPr>
-        <w:t>=</w:t>
-      </w:r>
-      <w:proofErr w:type="gramStart"/>
-      <w:r>
-        <w:rPr>
-          <w:rFonts w:ascii="Consolas" w:hAnsi="Consolas"/>
-          <w:sz w:val="20"/>
-          <w:szCs w:val="20"/>
-        </w:rPr>
-        <w:t>LOW){</w:t>
-      </w:r>
-      <w:proofErr w:type="gramEnd"/>
-      <w:r>
-        <w:rPr>
-          <w:rFonts w:ascii="Consolas" w:hAnsi="Consolas"/>
-          <w:sz w:val="20"/>
-          <w:szCs w:val="20"/>
-        </w:rPr>
-        <w:t xml:space="preserve"> // Lê e "seta" valores dos botões 2</w:t>
-      </w:r>
-    </w:p>
-    <w:p>
-      <w:pPr>
-        <w:spacing w:after="0" w:line="276" w:lineRule="auto"/>
-        <w:rPr>
-          <w:rFonts w:ascii="Consolas" w:hAnsi="Consolas"/>
-          <w:sz w:val="20"/>
-          <w:szCs w:val="20"/>
-        </w:rPr>
-      </w:pPr>
-      <w:r>
-        <w:rPr>
-          <w:rFonts w:ascii="Consolas" w:hAnsi="Consolas"/>
-          <w:sz w:val="20"/>
-          <w:szCs w:val="20"/>
-        </w:rPr>
-        <w:t>     </w:t>
-      </w:r>
-      <w:proofErr w:type="spellStart"/>
-      <w:r>
-        <w:rPr>
-          <w:rFonts w:ascii="Consolas" w:hAnsi="Consolas"/>
-          <w:sz w:val="20"/>
-          <w:szCs w:val="20"/>
-        </w:rPr>
-        <w:t>Joystick.setButton</w:t>
-      </w:r>
-      <w:proofErr w:type="spellEnd"/>
-      <w:r>
-        <w:rPr>
-          <w:rFonts w:ascii="Consolas" w:hAnsi="Consolas"/>
-          <w:sz w:val="20"/>
-          <w:szCs w:val="20"/>
-        </w:rPr>
-        <w:t>(x+4, 1</w:t>
-      </w:r>
-      <w:proofErr w:type="gramStart"/>
-      <w:r>
-        <w:rPr>
-          <w:rFonts w:ascii="Consolas" w:hAnsi="Consolas"/>
-          <w:sz w:val="20"/>
-          <w:szCs w:val="20"/>
-        </w:rPr>
-        <w:t>);  /</w:t>
-      </w:r>
-      <w:proofErr w:type="gramEnd"/>
-      <w:r>
-        <w:rPr>
-          <w:rFonts w:ascii="Consolas" w:hAnsi="Consolas"/>
-          <w:sz w:val="20"/>
-          <w:szCs w:val="20"/>
-        </w:rPr>
-        <w:t>/ x+4 equivale a 5, 6, 7 ou 8 dependendo do valor de x determinado pela rotina "FOR"</w:t>
-      </w:r>
-    </w:p>
-    <w:p>
-      <w:pPr>
-        <w:spacing w:after="0" w:line="276" w:lineRule="auto"/>
-        <w:rPr>
-          <w:rFonts w:ascii="Consolas" w:hAnsi="Consolas"/>
-          <w:sz w:val="20"/>
-          <w:szCs w:val="20"/>
-        </w:rPr>
-      </w:pPr>
-      <w:r>
-        <w:rPr>
-          <w:rFonts w:ascii="Consolas" w:hAnsi="Consolas"/>
-          <w:sz w:val="20"/>
-          <w:szCs w:val="20"/>
-        </w:rPr>
-        <w:t>   }</w:t>
-      </w:r>
-    </w:p>
-    <w:p>
-      <w:pPr>
-        <w:spacing w:after="0" w:line="276" w:lineRule="auto"/>
-        <w:rPr>
-          <w:rFonts w:ascii="Consolas" w:hAnsi="Consolas"/>
-          <w:sz w:val="20"/>
-          <w:szCs w:val="20"/>
-        </w:rPr>
-      </w:pPr>
-      <w:r>
-        <w:rPr>
-          <w:rFonts w:ascii="Consolas" w:hAnsi="Consolas"/>
-          <w:sz w:val="20"/>
-          <w:szCs w:val="20"/>
-        </w:rPr>
-        <w:t>   </w:t>
       </w:r>
       <w:proofErr w:type="spellStart"/>
       <w:proofErr w:type="gramStart"/>
@@ -6040,6 +5575,134 @@
           <w:sz w:val="20"/>
           <w:szCs w:val="20"/>
         </w:rPr>
+        <w:t>if</w:t>
+      </w:r>
+      <w:proofErr w:type="spellEnd"/>
+      <w:r>
+        <w:rPr>
+          <w:rFonts w:ascii="Consolas" w:hAnsi="Consolas"/>
+          <w:sz w:val="20"/>
+          <w:szCs w:val="20"/>
+        </w:rPr>
+        <w:t>(</w:t>
+      </w:r>
+      <w:proofErr w:type="spellStart"/>
+      <w:proofErr w:type="gramEnd"/>
+      <w:r>
+        <w:rPr>
+          <w:rFonts w:ascii="Consolas" w:hAnsi="Consolas"/>
+          <w:sz w:val="20"/>
+          <w:szCs w:val="20"/>
+        </w:rPr>
+        <w:t>digitalRead</w:t>
+      </w:r>
+      <w:proofErr w:type="spellEnd"/>
+      <w:r>
+        <w:rPr>
+          <w:rFonts w:ascii="Consolas" w:hAnsi="Consolas"/>
+          <w:sz w:val="20"/>
+          <w:szCs w:val="20"/>
+        </w:rPr>
+        <w:t>(botoes2Pins[x])==LOW){ // Lê e "seta" valores dos botões 2</w:t>
+      </w:r>
+    </w:p>
+    <w:p>
+      <w:pPr>
+        <w:spacing w:after="0" w:line="276" w:lineRule="auto"/>
+        <w:rPr>
+          <w:rFonts w:ascii="Consolas" w:hAnsi="Consolas"/>
+          <w:sz w:val="20"/>
+          <w:szCs w:val="20"/>
+        </w:rPr>
+      </w:pPr>
+      <w:r>
+        <w:rPr>
+          <w:rFonts w:ascii="Consolas" w:hAnsi="Consolas"/>
+          <w:sz w:val="20"/>
+          <w:szCs w:val="20"/>
+        </w:rPr>
+        <w:t>     </w:t>
+      </w:r>
+      <w:proofErr w:type="spellStart"/>
+      <w:r>
+        <w:rPr>
+          <w:rFonts w:ascii="Consolas" w:hAnsi="Consolas"/>
+          <w:sz w:val="20"/>
+          <w:szCs w:val="20"/>
+        </w:rPr>
+        <w:t>Joystick.setButton</w:t>
+      </w:r>
+      <w:proofErr w:type="spellEnd"/>
+      <w:r>
+        <w:rPr>
+          <w:rFonts w:ascii="Consolas" w:hAnsi="Consolas"/>
+          <w:sz w:val="20"/>
+          <w:szCs w:val="20"/>
+        </w:rPr>
+        <w:t>(x+4, 1</w:t>
+      </w:r>
+      <w:proofErr w:type="gramStart"/>
+      <w:r>
+        <w:rPr>
+          <w:rFonts w:ascii="Consolas" w:hAnsi="Consolas"/>
+          <w:sz w:val="20"/>
+          <w:szCs w:val="20"/>
+        </w:rPr>
+        <w:t>);  /</w:t>
+      </w:r>
+      <w:proofErr w:type="gramEnd"/>
+      <w:r>
+        <w:rPr>
+          <w:rFonts w:ascii="Consolas" w:hAnsi="Consolas"/>
+          <w:sz w:val="20"/>
+          <w:szCs w:val="20"/>
+        </w:rPr>
+        <w:t>/ x+4 equivale a 5, 6, 7 ou 8 dependendo do valor de x determinado pela rotina "FOR"</w:t>
+      </w:r>
+    </w:p>
+    <w:p>
+      <w:pPr>
+        <w:spacing w:after="0" w:line="276" w:lineRule="auto"/>
+        <w:rPr>
+          <w:rFonts w:ascii="Consolas" w:hAnsi="Consolas"/>
+          <w:sz w:val="20"/>
+          <w:szCs w:val="20"/>
+        </w:rPr>
+      </w:pPr>
+      <w:r>
+        <w:rPr>
+          <w:rFonts w:ascii="Consolas" w:hAnsi="Consolas"/>
+          <w:sz w:val="20"/>
+          <w:szCs w:val="20"/>
+        </w:rPr>
+        <w:t>   }</w:t>
+      </w:r>
+    </w:p>
+    <w:p>
+      <w:pPr>
+        <w:spacing w:after="0" w:line="276" w:lineRule="auto"/>
+        <w:rPr>
+          <w:rFonts w:ascii="Consolas" w:hAnsi="Consolas"/>
+          <w:sz w:val="20"/>
+          <w:szCs w:val="20"/>
+        </w:rPr>
+      </w:pPr>
+      <w:r>
+        <w:rPr>
+          <w:rFonts w:ascii="Consolas" w:hAnsi="Consolas"/>
+          <w:sz w:val="20"/>
+          <w:szCs w:val="20"/>
+        </w:rPr>
+        <w:t>   </w:t>
+      </w:r>
+      <w:proofErr w:type="spellStart"/>
+      <w:proofErr w:type="gramStart"/>
+      <w:r>
+        <w:rPr>
+          <w:rFonts w:ascii="Consolas" w:hAnsi="Consolas"/>
+          <w:sz w:val="20"/>
+          <w:szCs w:val="20"/>
+        </w:rPr>
         <w:t>else</w:t>
       </w:r>
       <w:proofErr w:type="spellEnd"/>
@@ -6285,6 +5948,7 @@
         <w:t xml:space="preserve">  </w:t>
       </w:r>
       <w:proofErr w:type="spellStart"/>
+      <w:proofErr w:type="gramStart"/>
       <w:r>
         <w:rPr>
           <w:rFonts w:ascii="Consolas" w:hAnsi="Consolas"/>
@@ -6303,6 +5967,7 @@
         <w:t>(</w:t>
       </w:r>
       <w:proofErr w:type="spellStart"/>
+      <w:proofErr w:type="gramEnd"/>
       <w:r>
         <w:rPr>
           <w:rFonts w:ascii="Consolas" w:hAnsi="Consolas"/>
@@ -6336,8 +6001,27 @@
           <w:sz w:val="20"/>
           <w:szCs w:val="20"/>
         </w:rPr>
-        <w:t>[0</w:t>
-      </w:r>
+        <w:t>[0])==LOW){Value_X1=  127;}  // DIREITA</w:t>
+      </w:r>
+    </w:p>
+    <w:p>
+      <w:pPr>
+        <w:spacing w:after="0" w:line="276" w:lineRule="auto"/>
+        <w:rPr>
+          <w:rFonts w:ascii="Consolas" w:hAnsi="Consolas"/>
+          <w:sz w:val="20"/>
+          <w:szCs w:val="20"/>
+        </w:rPr>
+      </w:pPr>
+      <w:r>
+        <w:rPr>
+          <w:rFonts w:ascii="Consolas" w:hAnsi="Consolas"/>
+          <w:sz w:val="20"/>
+          <w:szCs w:val="20"/>
+        </w:rPr>
+        <w:t xml:space="preserve">  </w:t>
+      </w:r>
+      <w:proofErr w:type="spellStart"/>
       <w:proofErr w:type="gramStart"/>
       <w:r>
         <w:rPr>
@@ -6345,8 +6029,18 @@
           <w:sz w:val="20"/>
           <w:szCs w:val="20"/>
         </w:rPr>
-        <w:t>])=</w:t>
-      </w:r>
+        <w:t>if</w:t>
+      </w:r>
+      <w:proofErr w:type="spellEnd"/>
+      <w:r>
+        <w:rPr>
+          <w:rFonts w:ascii="Consolas" w:hAnsi="Consolas"/>
+          <w:sz w:val="20"/>
+          <w:szCs w:val="20"/>
+        </w:rPr>
+        <w:t>(</w:t>
+      </w:r>
+      <w:proofErr w:type="spellStart"/>
       <w:proofErr w:type="gramEnd"/>
       <w:r>
         <w:rPr>
@@ -6354,8 +6048,54 @@
           <w:sz w:val="20"/>
           <w:szCs w:val="20"/>
         </w:rPr>
-        <w:t>=</w:t>
-      </w:r>
+        <w:t>digitalRead</w:t>
+      </w:r>
+      <w:proofErr w:type="spellEnd"/>
+      <w:r>
+        <w:rPr>
+          <w:rFonts w:ascii="Consolas" w:hAnsi="Consolas"/>
+          <w:sz w:val="20"/>
+          <w:szCs w:val="20"/>
+        </w:rPr>
+        <w:t>(</w:t>
+      </w:r>
+      <w:proofErr w:type="spellStart"/>
+      <w:r>
+        <w:rPr>
+          <w:rFonts w:ascii="Consolas" w:hAnsi="Consolas"/>
+          <w:sz w:val="20"/>
+          <w:szCs w:val="20"/>
+        </w:rPr>
+        <w:t>direcionalPins</w:t>
+      </w:r>
+      <w:proofErr w:type="spellEnd"/>
+      <w:r>
+        <w:rPr>
+          <w:rFonts w:ascii="Consolas" w:hAnsi="Consolas"/>
+          <w:sz w:val="20"/>
+          <w:szCs w:val="20"/>
+        </w:rPr>
+        <w:t>[1])==LOW){Value_X1= -127;}  // ESQUERDA</w:t>
+      </w:r>
+    </w:p>
+    <w:p>
+      <w:pPr>
+        <w:spacing w:after="0" w:line="276" w:lineRule="auto"/>
+        <w:rPr>
+          <w:rFonts w:ascii="Consolas" w:hAnsi="Consolas"/>
+          <w:sz w:val="20"/>
+          <w:szCs w:val="20"/>
+        </w:rPr>
+      </w:pPr>
+      <w:r>
+        <w:rPr>
+          <w:rFonts w:ascii="Consolas" w:hAnsi="Consolas"/>
+          <w:sz w:val="20"/>
+          <w:szCs w:val="20"/>
+        </w:rPr>
+        <w:t xml:space="preserve">  </w:t>
+      </w:r>
+      <w:proofErr w:type="spellStart"/>
       <w:proofErr w:type="gramStart"/>
       <w:r>
         <w:rPr>
@@ -6363,8 +6103,18 @@
           <w:sz w:val="20"/>
           <w:szCs w:val="20"/>
         </w:rPr>
-        <w:t>LOW){</w:t>
-      </w:r>
+        <w:t>if</w:t>
+      </w:r>
+      <w:proofErr w:type="spellEnd"/>
+      <w:r>
+        <w:rPr>
+          <w:rFonts w:ascii="Consolas" w:hAnsi="Consolas"/>
+          <w:sz w:val="20"/>
+          <w:szCs w:val="20"/>
+        </w:rPr>
+        <w:t>(</w:t>
+      </w:r>
+      <w:proofErr w:type="spellStart"/>
       <w:proofErr w:type="gramEnd"/>
       <w:r>
         <w:rPr>
@@ -6372,8 +6122,54 @@
           <w:sz w:val="20"/>
           <w:szCs w:val="20"/>
         </w:rPr>
-        <w:t>Value_X1</w:t>
-      </w:r>
+        <w:t>digitalRead</w:t>
+      </w:r>
+      <w:proofErr w:type="spellEnd"/>
+      <w:r>
+        <w:rPr>
+          <w:rFonts w:ascii="Consolas" w:hAnsi="Consolas"/>
+          <w:sz w:val="20"/>
+          <w:szCs w:val="20"/>
+        </w:rPr>
+        <w:t>(</w:t>
+      </w:r>
+      <w:proofErr w:type="spellStart"/>
+      <w:r>
+        <w:rPr>
+          <w:rFonts w:ascii="Consolas" w:hAnsi="Consolas"/>
+          <w:sz w:val="20"/>
+          <w:szCs w:val="20"/>
+        </w:rPr>
+        <w:t>direcionalPins</w:t>
+      </w:r>
+      <w:proofErr w:type="spellEnd"/>
+      <w:r>
+        <w:rPr>
+          <w:rFonts w:ascii="Consolas" w:hAnsi="Consolas"/>
+          <w:sz w:val="20"/>
+          <w:szCs w:val="20"/>
+        </w:rPr>
+        <w:t>[2])==LOW){Value_Y1=  127;}  // BAIXO</w:t>
+      </w:r>
+    </w:p>
+    <w:p>
+      <w:pPr>
+        <w:spacing w:after="0" w:line="276" w:lineRule="auto"/>
+        <w:rPr>
+          <w:rFonts w:ascii="Consolas" w:hAnsi="Consolas"/>
+          <w:sz w:val="20"/>
+          <w:szCs w:val="20"/>
+        </w:rPr>
+      </w:pPr>
+      <w:r>
+        <w:rPr>
+          <w:rFonts w:ascii="Consolas" w:hAnsi="Consolas"/>
+          <w:sz w:val="20"/>
+          <w:szCs w:val="20"/>
+        </w:rPr>
+        <w:t xml:space="preserve">  </w:t>
+      </w:r>
+      <w:proofErr w:type="spellStart"/>
       <w:proofErr w:type="gramStart"/>
       <w:r>
         <w:rPr>
@@ -6381,8 +6177,18 @@
           <w:sz w:val="20"/>
           <w:szCs w:val="20"/>
         </w:rPr>
-        <w:t>=  127;}  /</w:t>
-      </w:r>
+        <w:t>if</w:t>
+      </w:r>
+      <w:proofErr w:type="spellEnd"/>
+      <w:r>
+        <w:rPr>
+          <w:rFonts w:ascii="Consolas" w:hAnsi="Consolas"/>
+          <w:sz w:val="20"/>
+          <w:szCs w:val="20"/>
+        </w:rPr>
+        <w:t>(</w:t>
+      </w:r>
+      <w:proofErr w:type="spellStart"/>
       <w:proofErr w:type="gramEnd"/>
       <w:r>
         <w:rPr>
@@ -6390,25 +6196,16 @@
           <w:sz w:val="20"/>
           <w:szCs w:val="20"/>
         </w:rPr>
-        <w:t>/ DIREITA</w:t>
-      </w:r>
-    </w:p>
-    <w:p>
-      <w:pPr>
-        <w:spacing w:after="0" w:line="276" w:lineRule="auto"/>
-        <w:rPr>
-          <w:rFonts w:ascii="Consolas" w:hAnsi="Consolas"/>
-          <w:sz w:val="20"/>
-          <w:szCs w:val="20"/>
-        </w:rPr>
-      </w:pPr>
-      <w:r>
-        <w:rPr>
-          <w:rFonts w:ascii="Consolas" w:hAnsi="Consolas"/>
-          <w:sz w:val="20"/>
-          <w:szCs w:val="20"/>
-        </w:rPr>
-        <w:t xml:space="preserve">  </w:t>
+        <w:t>digitalRead</w:t>
+      </w:r>
+      <w:proofErr w:type="spellEnd"/>
+      <w:r>
+        <w:rPr>
+          <w:rFonts w:ascii="Consolas" w:hAnsi="Consolas"/>
+          <w:sz w:val="20"/>
+          <w:szCs w:val="20"/>
+        </w:rPr>
+        <w:t>(</w:t>
       </w:r>
       <w:proofErr w:type="spellStart"/>
       <w:r>
@@ -6417,7 +6214,7 @@
           <w:sz w:val="20"/>
           <w:szCs w:val="20"/>
         </w:rPr>
-        <w:t>if</w:t>
+        <w:t>direcionalPins</w:t>
       </w:r>
       <w:proofErr w:type="spellEnd"/>
       <w:r>
@@ -6426,349 +6223,7 @@
           <w:sz w:val="20"/>
           <w:szCs w:val="20"/>
         </w:rPr>
-        <w:t>(</w:t>
-      </w:r>
-      <w:proofErr w:type="spellStart"/>
-      <w:r>
-        <w:rPr>
-          <w:rFonts w:ascii="Consolas" w:hAnsi="Consolas"/>
-          <w:sz w:val="20"/>
-          <w:szCs w:val="20"/>
-        </w:rPr>
-        <w:t>digitalRead</w:t>
-      </w:r>
-      <w:proofErr w:type="spellEnd"/>
-      <w:r>
-        <w:rPr>
-          <w:rFonts w:ascii="Consolas" w:hAnsi="Consolas"/>
-          <w:sz w:val="20"/>
-          <w:szCs w:val="20"/>
-        </w:rPr>
-        <w:t>(</w:t>
-      </w:r>
-      <w:proofErr w:type="spellStart"/>
-      <w:r>
-        <w:rPr>
-          <w:rFonts w:ascii="Consolas" w:hAnsi="Consolas"/>
-          <w:sz w:val="20"/>
-          <w:szCs w:val="20"/>
-        </w:rPr>
-        <w:t>direcionalPins</w:t>
-      </w:r>
-      <w:proofErr w:type="spellEnd"/>
-      <w:r>
-        <w:rPr>
-          <w:rFonts w:ascii="Consolas" w:hAnsi="Consolas"/>
-          <w:sz w:val="20"/>
-          <w:szCs w:val="20"/>
-        </w:rPr>
-        <w:t>[1</w:t>
-      </w:r>
-      <w:proofErr w:type="gramStart"/>
-      <w:r>
-        <w:rPr>
-          <w:rFonts w:ascii="Consolas" w:hAnsi="Consolas"/>
-          <w:sz w:val="20"/>
-          <w:szCs w:val="20"/>
-        </w:rPr>
-        <w:t>])=</w:t>
-      </w:r>
-      <w:proofErr w:type="gramEnd"/>
-      <w:r>
-        <w:rPr>
-          <w:rFonts w:ascii="Consolas" w:hAnsi="Consolas"/>
-          <w:sz w:val="20"/>
-          <w:szCs w:val="20"/>
-        </w:rPr>
-        <w:t>=</w:t>
-      </w:r>
-      <w:proofErr w:type="gramStart"/>
-      <w:r>
-        <w:rPr>
-          <w:rFonts w:ascii="Consolas" w:hAnsi="Consolas"/>
-          <w:sz w:val="20"/>
-          <w:szCs w:val="20"/>
-        </w:rPr>
-        <w:t>LOW){</w:t>
-      </w:r>
-      <w:proofErr w:type="gramEnd"/>
-      <w:r>
-        <w:rPr>
-          <w:rFonts w:ascii="Consolas" w:hAnsi="Consolas"/>
-          <w:sz w:val="20"/>
-          <w:szCs w:val="20"/>
-        </w:rPr>
-        <w:t>Value_X1= -127</w:t>
-      </w:r>
-      <w:proofErr w:type="gramStart"/>
-      <w:r>
-        <w:rPr>
-          <w:rFonts w:ascii="Consolas" w:hAnsi="Consolas"/>
-          <w:sz w:val="20"/>
-          <w:szCs w:val="20"/>
-        </w:rPr>
-        <w:t>;}  /</w:t>
-      </w:r>
-      <w:proofErr w:type="gramEnd"/>
-      <w:r>
-        <w:rPr>
-          <w:rFonts w:ascii="Consolas" w:hAnsi="Consolas"/>
-          <w:sz w:val="20"/>
-          <w:szCs w:val="20"/>
-        </w:rPr>
-        <w:t>/ ESQUERDA</w:t>
-      </w:r>
-    </w:p>
-    <w:p>
-      <w:pPr>
-        <w:spacing w:after="0" w:line="276" w:lineRule="auto"/>
-        <w:rPr>
-          <w:rFonts w:ascii="Consolas" w:hAnsi="Consolas"/>
-          <w:sz w:val="20"/>
-          <w:szCs w:val="20"/>
-        </w:rPr>
-      </w:pPr>
-      <w:r>
-        <w:rPr>
-          <w:rFonts w:ascii="Consolas" w:hAnsi="Consolas"/>
-          <w:sz w:val="20"/>
-          <w:szCs w:val="20"/>
-        </w:rPr>
-        <w:t xml:space="preserve">  </w:t>
-      </w:r>
-      <w:proofErr w:type="spellStart"/>
-      <w:r>
-        <w:rPr>
-          <w:rFonts w:ascii="Consolas" w:hAnsi="Consolas"/>
-          <w:sz w:val="20"/>
-          <w:szCs w:val="20"/>
-        </w:rPr>
-        <w:t>if</w:t>
-      </w:r>
-      <w:proofErr w:type="spellEnd"/>
-      <w:r>
-        <w:rPr>
-          <w:rFonts w:ascii="Consolas" w:hAnsi="Consolas"/>
-          <w:sz w:val="20"/>
-          <w:szCs w:val="20"/>
-        </w:rPr>
-        <w:t>(</w:t>
-      </w:r>
-      <w:proofErr w:type="spellStart"/>
-      <w:r>
-        <w:rPr>
-          <w:rFonts w:ascii="Consolas" w:hAnsi="Consolas"/>
-          <w:sz w:val="20"/>
-          <w:szCs w:val="20"/>
-        </w:rPr>
-        <w:t>digitalRead</w:t>
-      </w:r>
-      <w:proofErr w:type="spellEnd"/>
-      <w:r>
-        <w:rPr>
-          <w:rFonts w:ascii="Consolas" w:hAnsi="Consolas"/>
-          <w:sz w:val="20"/>
-          <w:szCs w:val="20"/>
-        </w:rPr>
-        <w:t>(</w:t>
-      </w:r>
-      <w:proofErr w:type="spellStart"/>
-      <w:r>
-        <w:rPr>
-          <w:rFonts w:ascii="Consolas" w:hAnsi="Consolas"/>
-          <w:sz w:val="20"/>
-          <w:szCs w:val="20"/>
-        </w:rPr>
-        <w:t>direcionalPins</w:t>
-      </w:r>
-      <w:proofErr w:type="spellEnd"/>
-      <w:r>
-        <w:rPr>
-          <w:rFonts w:ascii="Consolas" w:hAnsi="Consolas"/>
-          <w:sz w:val="20"/>
-          <w:szCs w:val="20"/>
-        </w:rPr>
-        <w:t>[2</w:t>
-      </w:r>
-      <w:proofErr w:type="gramStart"/>
-      <w:r>
-        <w:rPr>
-          <w:rFonts w:ascii="Consolas" w:hAnsi="Consolas"/>
-          <w:sz w:val="20"/>
-          <w:szCs w:val="20"/>
-        </w:rPr>
-        <w:t>])=</w:t>
-      </w:r>
-      <w:proofErr w:type="gramEnd"/>
-      <w:r>
-        <w:rPr>
-          <w:rFonts w:ascii="Consolas" w:hAnsi="Consolas"/>
-          <w:sz w:val="20"/>
-          <w:szCs w:val="20"/>
-        </w:rPr>
-        <w:t>=</w:t>
-      </w:r>
-      <w:proofErr w:type="gramStart"/>
-      <w:r>
-        <w:rPr>
-          <w:rFonts w:ascii="Consolas" w:hAnsi="Consolas"/>
-          <w:sz w:val="20"/>
-          <w:szCs w:val="20"/>
-        </w:rPr>
-        <w:t>LOW){</w:t>
-      </w:r>
-      <w:proofErr w:type="gramEnd"/>
-      <w:r>
-        <w:rPr>
-          <w:rFonts w:ascii="Consolas" w:hAnsi="Consolas"/>
-          <w:sz w:val="20"/>
-          <w:szCs w:val="20"/>
-        </w:rPr>
-        <w:t>Value_Y1</w:t>
-      </w:r>
-      <w:proofErr w:type="gramStart"/>
-      <w:r>
-        <w:rPr>
-          <w:rFonts w:ascii="Consolas" w:hAnsi="Consolas"/>
-          <w:sz w:val="20"/>
-          <w:szCs w:val="20"/>
-        </w:rPr>
-        <w:t>=  127;}  /</w:t>
-      </w:r>
-      <w:proofErr w:type="gramEnd"/>
-      <w:r>
-        <w:rPr>
-          <w:rFonts w:ascii="Consolas" w:hAnsi="Consolas"/>
-          <w:sz w:val="20"/>
-          <w:szCs w:val="20"/>
-        </w:rPr>
-        <w:t>/ BAIXO</w:t>
-      </w:r>
-    </w:p>
-    <w:p>
-      <w:pPr>
-        <w:spacing w:after="0" w:line="276" w:lineRule="auto"/>
-        <w:rPr>
-          <w:rFonts w:ascii="Consolas" w:hAnsi="Consolas"/>
-          <w:sz w:val="20"/>
-          <w:szCs w:val="20"/>
-        </w:rPr>
-      </w:pPr>
-      <w:r>
-        <w:rPr>
-          <w:rFonts w:ascii="Consolas" w:hAnsi="Consolas"/>
-          <w:sz w:val="20"/>
-          <w:szCs w:val="20"/>
-        </w:rPr>
-        <w:t xml:space="preserve">  </w:t>
-      </w:r>
-      <w:proofErr w:type="spellStart"/>
-      <w:r>
-        <w:rPr>
-          <w:rFonts w:ascii="Consolas" w:hAnsi="Consolas"/>
-          <w:sz w:val="20"/>
-          <w:szCs w:val="20"/>
-        </w:rPr>
-        <w:t>if</w:t>
-      </w:r>
-      <w:proofErr w:type="spellEnd"/>
-      <w:r>
-        <w:rPr>
-          <w:rFonts w:ascii="Consolas" w:hAnsi="Consolas"/>
-          <w:sz w:val="20"/>
-          <w:szCs w:val="20"/>
-        </w:rPr>
-        <w:t>(</w:t>
-      </w:r>
-      <w:proofErr w:type="spellStart"/>
-      <w:r>
-        <w:rPr>
-          <w:rFonts w:ascii="Consolas" w:hAnsi="Consolas"/>
-          <w:sz w:val="20"/>
-          <w:szCs w:val="20"/>
-        </w:rPr>
-        <w:t>digitalRead</w:t>
-      </w:r>
-      <w:proofErr w:type="spellEnd"/>
-      <w:r>
-        <w:rPr>
-          <w:rFonts w:ascii="Consolas" w:hAnsi="Consolas"/>
-          <w:sz w:val="20"/>
-          <w:szCs w:val="20"/>
-        </w:rPr>
-        <w:t>(</w:t>
-      </w:r>
-      <w:proofErr w:type="spellStart"/>
-      <w:r>
-        <w:rPr>
-          <w:rFonts w:ascii="Consolas" w:hAnsi="Consolas"/>
-          <w:sz w:val="20"/>
-          <w:szCs w:val="20"/>
-        </w:rPr>
-        <w:t>direcionalPins</w:t>
-      </w:r>
-      <w:proofErr w:type="spellEnd"/>
-      <w:r>
-        <w:rPr>
-          <w:rFonts w:ascii="Consolas" w:hAnsi="Consolas"/>
-          <w:sz w:val="20"/>
-          <w:szCs w:val="20"/>
-        </w:rPr>
-        <w:t>[3</w:t>
-      </w:r>
-      <w:proofErr w:type="gramStart"/>
-      <w:r>
-        <w:rPr>
-          <w:rFonts w:ascii="Consolas" w:hAnsi="Consolas"/>
-          <w:sz w:val="20"/>
-          <w:szCs w:val="20"/>
-        </w:rPr>
-        <w:t>])=</w:t>
-      </w:r>
-      <w:proofErr w:type="gramEnd"/>
-      <w:r>
-        <w:rPr>
-          <w:rFonts w:ascii="Consolas" w:hAnsi="Consolas"/>
-          <w:sz w:val="20"/>
-          <w:szCs w:val="20"/>
-        </w:rPr>
-        <w:t>=</w:t>
-      </w:r>
-      <w:proofErr w:type="gramStart"/>
-      <w:r>
-        <w:rPr>
-          <w:rFonts w:ascii="Consolas" w:hAnsi="Consolas"/>
-          <w:sz w:val="20"/>
-          <w:szCs w:val="20"/>
-        </w:rPr>
-        <w:t>LOW){</w:t>
-      </w:r>
-      <w:proofErr w:type="gramEnd"/>
-      <w:r>
-        <w:rPr>
-          <w:rFonts w:ascii="Consolas" w:hAnsi="Consolas"/>
-          <w:sz w:val="20"/>
-          <w:szCs w:val="20"/>
-        </w:rPr>
-        <w:t>Value_Y1= -127</w:t>
-      </w:r>
-      <w:proofErr w:type="gramStart"/>
-      <w:r>
-        <w:rPr>
-          <w:rFonts w:ascii="Consolas" w:hAnsi="Consolas"/>
-          <w:sz w:val="20"/>
-          <w:szCs w:val="20"/>
-        </w:rPr>
-        <w:t>;}  /</w:t>
-      </w:r>
-      <w:proofErr w:type="gramEnd"/>
-      <w:r>
-        <w:rPr>
-          <w:rFonts w:ascii="Consolas" w:hAnsi="Consolas"/>
-          <w:sz w:val="20"/>
-          <w:szCs w:val="20"/>
-        </w:rPr>
-        <w:t>/ CIMA</w:t>
+        <w:t>[3])==LOW){Value_Y1= -127;}  // CIMA</w:t>
       </w:r>
     </w:p>
     <w:p>
@@ -8005,6 +7460,7 @@
           <w:noProof/>
           <w:sz w:val="20"/>
           <w:szCs w:val="20"/>
+          <w:lang w:eastAsia="pt-BR"/>
         </w:rPr>
         <w:drawing>
           <wp:anchor distT="0" distB="0" distL="114300" distR="114300" simplePos="0" relativeHeight="251659264" behindDoc="0" locked="0" layoutInCell="1" allowOverlap="1" wp14:anchorId="34254C92" wp14:editId="14F50EF9">
@@ -8074,6 +7530,7 @@
           <w:noProof/>
           <w:sz w:val="20"/>
           <w:szCs w:val="20"/>
+          <w:lang w:eastAsia="pt-BR"/>
         </w:rPr>
         <w:drawing>
           <wp:inline distT="0" distB="0" distL="0" distR="0" wp14:anchorId="2F100FA9" wp14:editId="3116945A">
@@ -8174,6 +7631,7 @@
           <w:noProof/>
           <w:sz w:val="28"/>
           <w:szCs w:val="28"/>
+          <w:lang w:eastAsia="pt-BR"/>
         </w:rPr>
         <w:drawing>
           <wp:anchor distT="0" distB="0" distL="114300" distR="114300" simplePos="0" relativeHeight="251660288" behindDoc="0" locked="0" layoutInCell="1" allowOverlap="1" wp14:anchorId="46C0B968" wp14:editId="0EF03B10">
@@ -8236,6 +7694,7 @@
           <w:noProof/>
           <w:sz w:val="28"/>
           <w:szCs w:val="28"/>
+          <w:lang w:eastAsia="pt-BR"/>
         </w:rPr>
         <w:drawing>
           <wp:inline distT="0" distB="0" distL="0" distR="0" wp14:anchorId="06CC9291" wp14:editId="63FD7EA4">
@@ -8285,72 +7744,77 @@
         <w:spacing w:after="0" w:line="360" w:lineRule="auto"/>
         <w:jc w:val="both"/>
         <w:rPr>
-          <w:sz w:val="28"/>
-          <w:szCs w:val="28"/>
-        </w:rPr>
-      </w:pPr>
-      <w:r>
-        <w:rPr>
           <w:noProof/>
           <w:sz w:val="28"/>
           <w:szCs w:val="28"/>
-        </w:rPr>
-        <w:drawing>
-          <wp:anchor distT="0" distB="0" distL="114300" distR="114300" simplePos="0" relativeHeight="251661312" behindDoc="0" locked="0" layoutInCell="1" allowOverlap="1" wp14:anchorId="4C086434" wp14:editId="43D3CFCF">
-            <wp:simplePos x="1082040" y="5928360"/>
-            <wp:positionH relativeFrom="margin">
-              <wp:align>center</wp:align>
-            </wp:positionH>
-            <wp:positionV relativeFrom="margin">
-              <wp:align>bottom</wp:align>
-            </wp:positionV>
-            <wp:extent cx="4572000" cy="3429000"/>
-            <wp:effectExtent l="0" t="0" r="0" b="0"/>
-            <wp:wrapSquare wrapText="bothSides"/>
-            <wp:docPr id="1432986908" name="Vídeo 3" descr="Protótipo Físico - Vídeo 1 - Historiando">
-              <a:hlinkClick xmlns:a="http://schemas.openxmlformats.org/drawingml/2006/main" r:id="rId25"/>
-            </wp:docPr>
-            <wp:cNvGraphicFramePr>
-              <a:graphicFrameLocks xmlns:a="http://schemas.openxmlformats.org/drawingml/2006/main" noChangeAspect="1"/>
-            </wp:cNvGraphicFramePr>
-            <a:graphic xmlns:a="http://schemas.openxmlformats.org/drawingml/2006/main">
-              <a:graphicData uri="http://schemas.openxmlformats.org/drawingml/2006/picture">
-                <pic:pic xmlns:pic="http://schemas.openxmlformats.org/drawingml/2006/picture">
-                  <pic:nvPicPr>
-                    <pic:cNvPr id="1432986908" name="Vídeo 3" descr="Protótipo Físico - Vídeo 1 - Historiando">
-                      <a:hlinkClick r:id="rId25"/>
-                    </pic:cNvPr>
-                    <pic:cNvPicPr/>
-                  </pic:nvPicPr>
-                  <pic:blipFill>
-                    <a:blip r:embed="rId26">
-                      <a:extLst>
-                        <a:ext uri="{28A0092B-C50C-407E-A947-70E740481C1C}">
-                          <a14:useLocalDpi xmlns:a14="http://schemas.microsoft.com/office/drawing/2010/main" val="0"/>
-                        </a:ext>
-                        <a:ext uri="{C809E66F-F1BF-436E-b5F7-EEA9579F0CBA}">
-                          <wp15:webVideoPr xmlns:wp15="http://schemas.microsoft.com/office/word/2012/wordprocessingDrawing" embeddedHtml="&lt;iframe width=&quot;113&quot; height=&quot;200&quot; src=&quot;https://www.youtube.com/embed/mj1eX31Pmjw?feature=oembed&quot; frameborder=&quot;0&quot; allow=&quot;accelerometer; autoplay; clipboard-write; encrypted-media; gyroscope; picture-in-picture; web-share&quot; referrerpolicy=&quot;strict-origin-when-cross-origin&quot; allowfullscreen=&quot;&quot; title=&quot;Protótipo Físico - Vídeo 1 - Historiando&quot; sandbox=&quot;allow-scripts allow-same-origin allow-popups&quot;&gt;&lt;/iframe&gt;" h="200" w="113"/>
-                        </a:ext>
-                      </a:extLst>
-                    </a:blip>
-                    <a:stretch>
-                      <a:fillRect/>
-                    </a:stretch>
-                  </pic:blipFill>
-                  <pic:spPr>
-                    <a:xfrm>
-                      <a:off x="0" y="0"/>
-                      <a:ext cx="4572000" cy="3429000"/>
-                    </a:xfrm>
-                    <a:prstGeom prst="rect">
-                      <a:avLst/>
-                    </a:prstGeom>
-                  </pic:spPr>
-                </pic:pic>
-              </a:graphicData>
-            </a:graphic>
-          </wp:anchor>
-        </w:drawing>
+          <w:lang w:eastAsia="pt-BR"/>
+        </w:rPr>
+      </w:pPr>
+    </w:p>
+    <w:p>
+      <w:pPr>
+        <w:spacing w:after="0" w:line="360" w:lineRule="auto"/>
+        <w:jc w:val="both"/>
+        <w:rPr>
+          <w:noProof/>
+          <w:sz w:val="28"/>
+          <w:szCs w:val="28"/>
+          <w:lang w:eastAsia="pt-BR"/>
+        </w:rPr>
+      </w:pPr>
+    </w:p>
+    <w:p>
+      <w:pPr>
+        <w:spacing w:after="0" w:line="360" w:lineRule="auto"/>
+        <w:jc w:val="both"/>
+        <w:rPr>
+          <w:noProof/>
+          <w:sz w:val="28"/>
+          <w:szCs w:val="28"/>
+          <w:lang w:eastAsia="pt-BR"/>
+        </w:rPr>
+      </w:pPr>
+      <w:bookmarkStart w:id="0" w:name="_GoBack"/>
+      <w:bookmarkEnd w:id="0"/>
+    </w:p>
+    <w:p>
+      <w:pPr>
+        <w:spacing w:after="0" w:line="360" w:lineRule="auto"/>
+        <w:jc w:val="both"/>
+        <w:rPr>
+          <w:sz w:val="28"/>
+          <w:szCs w:val="28"/>
+        </w:rPr>
+      </w:pPr>
+      <w:r>
+        <w:rPr>
+          <w:noProof/>
+          <w:sz w:val="28"/>
+          <w:szCs w:val="28"/>
+          <w:lang w:eastAsia="pt-BR"/>
+        </w:rPr>
+        <w:t xml:space="preserve">Link do vídeo: </w:t>
+      </w:r>
+      <w:hyperlink r:id="rId25" w:history="1">
+        <w:r>
+          <w:rPr>
+            <w:rStyle w:val="Hyperlink"/>
+            <w:noProof/>
+            <w:sz w:val="28"/>
+            <w:szCs w:val="28"/>
+            <w:lang w:eastAsia="pt-BR"/>
+          </w:rPr>
+          <w:t>https://youtu.be/mj1eX31Pmjw?si=YwGPwO5Qw33_njXH</w:t>
+        </w:r>
+      </w:hyperlink>
+      <w:r>
+        <w:rPr>
+          <w:noProof/>
+          <w:sz w:val="28"/>
+          <w:szCs w:val="28"/>
+          <w:lang w:eastAsia="pt-BR"/>
+        </w:rPr>
+        <w:t xml:space="preserve"> </w:t>
       </w:r>
     </w:p>
     <w:sectPr>
@@ -8364,7 +7828,7 @@
 </file>
 
 <file path=word/numbering.xml><?xml version="1.0" encoding="utf-8"?>
-<w:numbering xmlns:wpc="http://schemas.microsoft.com/office/word/2010/wordprocessingCanvas" xmlns:cx="http://schemas.microsoft.com/office/drawing/2014/chartex" xmlns:cx1="http://schemas.microsoft.com/office/drawing/2015/9/8/chartex" xmlns:cx2="http://schemas.microsoft.com/office/drawing/2015/10/21/chartex" xmlns:cx3="http://schemas.microsoft.com/office/drawing/2016/5/9/chartex" xmlns:cx4="http://schemas.microsoft.com/office/drawing/2016/5/10/chartex" xmlns:cx5="http://schemas.microsoft.com/office/drawing/2016/5/11/chartex" xmlns:cx6="http://schemas.microsoft.com/office/drawing/2016/5/12/chartex" xmlns:cx7="http://schemas.microsoft.com/office/drawing/2016/5/13/chartex" xmlns:cx8="http://schemas.microsoft.com/office/drawing/2016/5/14/chartex" xmlns:mc="http://schemas.openxmlformats.org/markup-compatibility/2006" xmlns:aink="http://schemas.microsoft.com/office/drawing/2016/ink" xmlns:am3d="http://schemas.microsoft.com/office/drawing/2017/model3d" xmlns:o="urn:schemas-microsoft-com:office:office" xmlns:oel="http://schemas.microsoft.com/office/2019/extlst" xmlns:r="http://schemas.openxmlformats.org/officeDocument/2006/relationships" xmlns:m="http://schemas.openxmlformats.org/officeDocument/2006/math" xmlns:v="urn:schemas-microsoft-com:vml" xmlns:wp14="http://schemas.microsoft.com/office/word/2010/wordprocessingDrawing" xmlns:wp="http://schemas.openxmlformats.org/drawingml/2006/wordprocessingDrawing" xmlns:w10="urn:schemas-microsoft-com:office:word" xmlns:w="http://schemas.openxmlformats.org/wordprocessingml/2006/main" xmlns:w14="http://schemas.microsoft.com/office/word/2010/wordml" xmlns:w15="http://schemas.microsoft.com/office/word/2012/wordml" xmlns:w16cex="http://schemas.microsoft.com/office/word/2018/wordml/cex" xmlns:w16cid="http://schemas.microsoft.com/office/word/2016/wordml/cid" xmlns:w16="http://schemas.microsoft.com/office/word/2018/wordml" xmlns:w16du="http://schemas.microsoft.com/office/word/2023/wordml/word16du" xmlns:w16sdtdh="http://schemas.microsoft.com/office/word/2020/wordml/sdtdatahash" xmlns:w16sdtfl="http://schemas.microsoft.com/office/word/2024/wordml/sdtformatlock" xmlns:w16se="http://schemas.microsoft.com/office/word/2015/wordml/symex" xmlns:wpg="http://schemas.microsoft.com/office/word/2010/wordprocessingGroup" xmlns:wpi="http://schemas.microsoft.com/office/word/2010/wordprocessingInk" xmlns:wne="http://schemas.microsoft.com/office/word/2006/wordml" xmlns:wps="http://schemas.microsoft.com/office/word/2010/wordprocessingShape" mc:Ignorable="w14 w15 w16se w16cid w16 w16cex w16sdtdh w16sdtfl w16du wp14">
+<w:numbering xmlns:wpc="http://schemas.microsoft.com/office/word/2010/wordprocessingCanvas" xmlns:cx="http://schemas.microsoft.com/office/drawing/2014/chartex" xmlns:mc="http://schemas.openxmlformats.org/markup-compatibility/2006" xmlns:o="urn:schemas-microsoft-com:office:office" xmlns:r="http://schemas.openxmlformats.org/officeDocument/2006/relationships" xmlns:m="http://schemas.openxmlformats.org/officeDocument/2006/math" xmlns:v="urn:schemas-microsoft-com:vml" xmlns:wp14="http://schemas.microsoft.com/office/word/2010/wordprocessingDrawing" xmlns:wp="http://schemas.openxmlformats.org/drawingml/2006/wordprocessingDrawing" xmlns:w10="urn:schemas-microsoft-com:office:word" xmlns:w="http://schemas.openxmlformats.org/wordprocessingml/2006/main" xmlns:w14="http://schemas.microsoft.com/office/word/2010/wordml" xmlns:w15="http://schemas.microsoft.com/office/word/2012/wordml" xmlns:w16se="http://schemas.microsoft.com/office/word/2015/wordml/symex" xmlns:wpg="http://schemas.microsoft.com/office/word/2010/wordprocessingGroup" xmlns:wpi="http://schemas.microsoft.com/office/word/2010/wordprocessingInk" xmlns:wne="http://schemas.microsoft.com/office/word/2006/wordml" xmlns:wps="http://schemas.microsoft.com/office/word/2010/wordprocessingShape" mc:Ignorable="w14 w15 w16se wp14">
   <w:abstractNum w:abstractNumId="0" w15:restartNumberingAfterBreak="0">
     <w:nsid w:val="24076717"/>
     <w:multiLevelType w:val="hybridMultilevel"/>
@@ -8680,20 +8144,20 @@
       </w:pPr>
     </w:lvl>
   </w:abstractNum>
-  <w:num w:numId="1" w16cid:durableId="608895088">
+  <w:num w:numId="1">
     <w:abstractNumId w:val="2"/>
   </w:num>
-  <w:num w:numId="2" w16cid:durableId="26878089">
+  <w:num w:numId="2">
     <w:abstractNumId w:val="1"/>
   </w:num>
-  <w:num w:numId="3" w16cid:durableId="1890023094">
+  <w:num w:numId="3">
     <w:abstractNumId w:val="0"/>
   </w:num>
 </w:numbering>
 </file>
 
 <file path=word/styles.xml><?xml version="1.0" encoding="utf-8"?>
-<w:styles xmlns:mc="http://schemas.openxmlformats.org/markup-compatibility/2006" xmlns:r="http://schemas.openxmlformats.org/officeDocument/2006/relationships" xmlns:w="http://schemas.openxmlformats.org/wordprocessingml/2006/main" xmlns:w14="http://schemas.microsoft.com/office/word/2010/wordml" xmlns:w15="http://schemas.microsoft.com/office/word/2012/wordml" xmlns:w16cex="http://schemas.microsoft.com/office/word/2018/wordml/cex" xmlns:w16cid="http://schemas.microsoft.com/office/word/2016/wordml/cid" xmlns:w16="http://schemas.microsoft.com/office/word/2018/wordml" xmlns:w16du="http://schemas.microsoft.com/office/word/2023/wordml/word16du" xmlns:w16sdtdh="http://schemas.microsoft.com/office/word/2020/wordml/sdtdatahash" xmlns:w16sdtfl="http://schemas.microsoft.com/office/word/2024/wordml/sdtformatlock" xmlns:w16se="http://schemas.microsoft.com/office/word/2015/wordml/symex" mc:Ignorable="w14 w15 w16se w16cid w16 w16cex w16sdtdh w16sdtfl w16du">
+<w:styles xmlns:mc="http://schemas.openxmlformats.org/markup-compatibility/2006" xmlns:r="http://schemas.openxmlformats.org/officeDocument/2006/relationships" xmlns:w="http://schemas.openxmlformats.org/wordprocessingml/2006/main" xmlns:w14="http://schemas.microsoft.com/office/word/2010/wordml" xmlns:w15="http://schemas.microsoft.com/office/word/2012/wordml" xmlns:w16se="http://schemas.microsoft.com/office/word/2015/wordml/symex" mc:Ignorable="w14 w15 w16se">
   <w:docDefaults>
     <w:rPrDefault>
       <w:rPr>
@@ -8709,7 +8173,7 @@
       </w:pPr>
     </w:pPrDefault>
   </w:docDefaults>
-  <w:latentStyles w:defLockedState="0" w:defUIPriority="99" w:defSemiHidden="0" w:defUnhideWhenUsed="0" w:defQFormat="0" w:count="376">
+  <w:latentStyles w:defLockedState="0" w:defUIPriority="99" w:defSemiHidden="0" w:defUnhideWhenUsed="0" w:defQFormat="0" w:count="371">
     <w:lsdException w:name="Normal" w:uiPriority="0" w:qFormat="1"/>
     <w:lsdException w:name="heading 1" w:uiPriority="9" w:qFormat="1"/>
     <w:lsdException w:name="heading 2" w:semiHidden="1" w:uiPriority="9" w:unhideWhenUsed="1" w:qFormat="1"/>
@@ -9081,11 +8545,6 @@
     <w:lsdException w:name="List Table 5 Dark Accent 6" w:uiPriority="50"/>
     <w:lsdException w:name="List Table 6 Colorful Accent 6" w:uiPriority="51"/>
     <w:lsdException w:name="List Table 7 Colorful Accent 6" w:uiPriority="52"/>
-    <w:lsdException w:name="Mention" w:semiHidden="1" w:unhideWhenUsed="1"/>
-    <w:lsdException w:name="Smart Hyperlink" w:semiHidden="1" w:unhideWhenUsed="1"/>
-    <w:lsdException w:name="Hashtag" w:semiHidden="1" w:unhideWhenUsed="1"/>
-    <w:lsdException w:name="Unresolved Mention" w:semiHidden="1" w:unhideWhenUsed="1"/>
-    <w:lsdException w:name="Smart Link" w:semiHidden="1" w:unhideWhenUsed="1"/>
   </w:latentStyles>
   <w:style w:type="paragraph" w:default="1" w:styleId="Normal">
     <w:name w:val="Normal"/>
@@ -9172,7 +8631,7 @@
       <w:shd w:val="clear" w:color="auto" w:fill="E1DFDD"/>
     </w:rPr>
   </w:style>
-  <w:style w:type="table" w:styleId="SimplesTabela1">
+  <w:style w:type="table" w:styleId="TabelaSimples1">
     <w:name w:val="Plain Table 1"/>
     <w:basedOn w:val="Tabelanormal"/>
     <w:uiPriority w:val="41"/>
@@ -9383,7 +8842,7 @@
       </w:tcPr>
     </w:tblStylePr>
   </w:style>
-  <w:style w:type="character" w:styleId="MenoPendente">
+  <w:style w:type="character" w:customStyle="1" w:styleId="UnresolvedMention">
     <w:name w:val="Unresolved Mention"/>
     <w:basedOn w:val="Fontepargpadro"/>
     <w:uiPriority w:val="99"/>
@@ -9694,18 +9153,6 @@
 </file>
 
 <file path=customXml/item1.xml><?xml version="1.0" encoding="utf-8"?>
-<p:properties xmlns:p="http://schemas.microsoft.com/office/2006/metadata/properties" xmlns:xsi="http://www.w3.org/2001/XMLSchema-instance" xmlns:pc="http://schemas.microsoft.com/office/infopath/2007/PartnerControls">
-  <documentManagement>
-    <ReferenceId xmlns="21e0ce27-b0e2-41aa-a79b-741a4637cbb0" xsi:nil="true"/>
-  </documentManagement>
-</p:properties>
-</file>
-
-<file path=customXml/item2.xml><?xml version="1.0" encoding="utf-8"?>
-<b:Sources xmlns:b="http://schemas.openxmlformats.org/officeDocument/2006/bibliography" xmlns="http://schemas.openxmlformats.org/officeDocument/2006/bibliography" SelectedStyle="\APASixthEditionOfficeOnline.xsl" StyleName="APA" Version="6"/>
-</file>
-
-<file path=customXml/item3.xml><?xml version="1.0" encoding="utf-8"?>
 <?mso-contentType ?>
 <FormTemplates xmlns="http://schemas.microsoft.com/sharepoint/v3/contenttype/forms">
   <Display>DocumentLibraryForm</Display>
@@ -9714,7 +9161,15 @@
 </FormTemplates>
 </file>
 
-<file path=customXml/item4.xml><?xml version="1.0" encoding="utf-8"?>
+<file path=customXml/item2.xml><?xml version="1.0" encoding="utf-8"?>
+<p:properties xmlns:p="http://schemas.microsoft.com/office/2006/metadata/properties" xmlns:xsi="http://www.w3.org/2001/XMLSchema-instance" xmlns:pc="http://schemas.microsoft.com/office/infopath/2007/PartnerControls">
+  <documentManagement>
+    <ReferenceId xmlns="21e0ce27-b0e2-41aa-a79b-741a4637cbb0" xsi:nil="true"/>
+  </documentManagement>
+</p:properties>
+</file>
+
+<file path=customXml/item3.xml><?xml version="1.0" encoding="utf-8"?>
 <ct:contentTypeSchema xmlns:ct="http://schemas.microsoft.com/office/2006/metadata/contentType" xmlns:ma="http://schemas.microsoft.com/office/2006/metadata/properties/metaAttributes" ct:_="" ma:_="" ma:contentTypeName="Documento" ma:contentTypeID="0x010100A192A8DA7517F145A9E0216687ED31D7" ma:contentTypeVersion="1" ma:contentTypeDescription="Crie um novo documento." ma:contentTypeScope="" ma:versionID="9f5fa407a8b3614354e067d3bc9b1bfc">
   <xsd:schema xmlns:xsd="http://www.w3.org/2001/XMLSchema" xmlns:xs="http://www.w3.org/2001/XMLSchema" xmlns:p="http://schemas.microsoft.com/office/2006/metadata/properties" xmlns:ns2="21e0ce27-b0e2-41aa-a79b-741a4637cbb0" targetNamespace="http://schemas.microsoft.com/office/2006/metadata/properties" ma:root="true" ma:fieldsID="7513b413246562f78619acd09f2e9488" ns2:_="">
     <xsd:import namespace="21e0ce27-b0e2-41aa-a79b-741a4637cbb0"/>
@@ -9840,7 +9295,19 @@
 </ct:contentTypeSchema>
 </file>
 
+<file path=customXml/item4.xml><?xml version="1.0" encoding="utf-8"?>
+<b:Sources xmlns:b="http://schemas.openxmlformats.org/officeDocument/2006/bibliography" xmlns="http://schemas.openxmlformats.org/officeDocument/2006/bibliography" SelectedStyle="\APASixthEditionOfficeOnline.xsl" StyleName="APA" Version="6"/>
+</file>
+
 <file path=customXml/itemProps1.xml><?xml version="1.0" encoding="utf-8"?>
+<ds:datastoreItem xmlns:ds="http://schemas.openxmlformats.org/officeDocument/2006/customXml" ds:itemID="{3091FFD0-3601-428E-B685-84AFEE0B15BE}">
+  <ds:schemaRefs>
+    <ds:schemaRef ds:uri="http://schemas.microsoft.com/sharepoint/v3/contenttype/forms"/>
+  </ds:schemaRefs>
+</ds:datastoreItem>
+</file>
+
+<file path=customXml/itemProps2.xml><?xml version="1.0" encoding="utf-8"?>
 <ds:datastoreItem xmlns:ds="http://schemas.openxmlformats.org/officeDocument/2006/customXml" ds:itemID="{5FE6D219-976A-4CE1-9EDB-A109B2021195}">
   <ds:schemaRefs>
     <ds:schemaRef ds:uri="http://schemas.microsoft.com/office/2006/metadata/properties"/>
@@ -9850,23 +9317,7 @@
 </ds:datastoreItem>
 </file>
 
-<file path=customXml/itemProps2.xml><?xml version="1.0" encoding="utf-8"?>
-<ds:datastoreItem xmlns:ds="http://schemas.openxmlformats.org/officeDocument/2006/customXml" ds:itemID="{C7171C10-B272-4A46-943A-6C5E77F1B20E}">
-  <ds:schemaRefs>
-    <ds:schemaRef ds:uri="http://schemas.openxmlformats.org/officeDocument/2006/bibliography"/>
-  </ds:schemaRefs>
-</ds:datastoreItem>
-</file>
-
 <file path=customXml/itemProps3.xml><?xml version="1.0" encoding="utf-8"?>
-<ds:datastoreItem xmlns:ds="http://schemas.openxmlformats.org/officeDocument/2006/customXml" ds:itemID="{3091FFD0-3601-428E-B685-84AFEE0B15BE}">
-  <ds:schemaRefs>
-    <ds:schemaRef ds:uri="http://schemas.microsoft.com/sharepoint/v3/contenttype/forms"/>
-  </ds:schemaRefs>
-</ds:datastoreItem>
-</file>
-
-<file path=customXml/itemProps4.xml><?xml version="1.0" encoding="utf-8"?>
 <ds:datastoreItem xmlns:ds="http://schemas.openxmlformats.org/officeDocument/2006/customXml" ds:itemID="{B91B99C2-1393-47E3-B4C0-ED746EF5618E}">
   <ds:schemaRefs>
     <ds:schemaRef ds:uri="http://schemas.microsoft.com/office/2006/metadata/contentType"/>
@@ -9882,4 +9333,12 @@
     <ds:schemaRef ds:uri="http://schemas.microsoft.com/internal/obd"/>
   </ds:schemaRefs>
 </ds:datastoreItem>
+</file>
+
+<file path=customXml/itemProps4.xml><?xml version="1.0" encoding="utf-8"?>
+<ds:datastoreItem xmlns:ds="http://schemas.openxmlformats.org/officeDocument/2006/customXml" ds:itemID="{D0102FE8-6D5F-409B-BA12-9911AE87D555}">
+  <ds:schemaRefs>
+    <ds:schemaRef ds:uri="http://schemas.openxmlformats.org/officeDocument/2006/bibliography"/>
+  </ds:schemaRefs>
+</ds:datastoreItem>
 </file>
</xml_diff>